<commit_message>
Refresh PCR-003 docx (PAR section); flag string vs DataFrame helpers in the brief
- Re-render PCR-003 so its committed .docx includes the Proven-acceptable-ranges
  section + "Char. range" label (the retrofit commit carried a stale pre-PAR docx).
- build_brief: tag string-returning helpers (title_block, related_docs_md, sop_table,
  corpus_docs_md, dev_register) as `print()`, not `show()` — removes a gate-iteration
  trap the PCR-008 authoring hit.
- HANDOFF: both PCR-003 and PCR-008 shipped with PAR sections; annex rebuilds pending.

Co-Authored-By: Claude Opus 4.8 <noreply@anthropic.com>
</commit_message>
<xml_diff>
--- a/pc_package/PCR-003_bioreactor.docx
+++ b/pc_package/PCR-003_bioreactor.docx
@@ -2981,7 +2981,7 @@
         <w:t xml:space="preserve"> </w:t>
       </w:r>
       <w:r>
-        <w:t xml:space="preserve">proven-acceptable experience: each PAR spans the characterized edges established for the</w:t>
+        <w:t xml:space="preserve">proven-acceptable experience: each characterization range spans the edges established for the</w:t>
       </w:r>
       <w:r>
         <w:t xml:space="preserve"> </w:t>
@@ -4010,7 +4010,7 @@
         <w:t xml:space="preserve"> </w:t>
       </w:r>
       <w:r>
-        <w:t xml:space="preserve">0 and its PAR edges are −1 and +1; effects and coefficients are reported on the coded factors,</w:t>
+        <w:t xml:space="preserve">0 and its characterization-range edges are −1 and +1; effects and coefficients are reported on the coded factors,</w:t>
       </w:r>
       <w:r>
         <w:t xml:space="preserve"> </w:t>
@@ -4159,7 +4159,7 @@
         <w:t xml:space="preserve"> </w:t>
       </w:r>
       <w:r>
-        <w:t xml:space="preserve">PAR is the characterized knowledge-space edge of each parameter and the NOR is the routine</w:t>
+        <w:t xml:space="preserve">characterization range is the knowledge-space edge of each parameter and the NOR is the routine</w:t>
       </w:r>
       <w:r>
         <w:t xml:space="preserve"> </w:t>
@@ -4198,7 +4198,7 @@
               <w:pStyle w:val="ImageCaption"/>
             </w:pPr>
             <w:r>
-              <w:t xml:space="preserve">Table 5: Production-bioreactor process parameters — set-point, normal operating range (NOR), proven acceptable range (PAR), final classification and study type.</w:t>
+              <w:t xml:space="preserve">Table 5: Production-bioreactor process parameters — set-point, normal operating range (NOR), characterization range, final classification and study type.</w:t>
             </w:r>
           </w:p>
           <w:tbl>
@@ -4209,13 +4209,13 @@
               <w:tblLook w:firstRow="1" w:lastRow="0" w:firstColumn="0" w:lastColumn="0" w:noHBand="0" w:noVBand="0" w:val="0020"/>
             </w:tblPr>
             <w:tblGrid>
-              <w:gridCol w:w="2286"/>
-              <w:gridCol w:w="1061"/>
-              <w:gridCol w:w="1061"/>
-              <w:gridCol w:w="898"/>
-              <w:gridCol w:w="734"/>
-              <w:gridCol w:w="734"/>
-              <w:gridCol w:w="1143"/>
+              <w:gridCol w:w="2153"/>
+              <w:gridCol w:w="999"/>
+              <w:gridCol w:w="999"/>
+              <w:gridCol w:w="845"/>
+              <w:gridCol w:w="1153"/>
+              <w:gridCol w:w="692"/>
+              <w:gridCol w:w="1076"/>
             </w:tblGrid>
             <w:tr>
               <w:trPr>
@@ -4282,7 +4282,7 @@
                     <w:jc w:val="center"/>
                   </w:pPr>
                   <w:r>
-                    <w:t xml:space="preserve">PAR</w:t>
+                    <w:t xml:space="preserve">Char. range</w:t>
                   </w:r>
                 </w:p>
               </w:tc>
@@ -5600,7 +5600,7 @@
         <w:t xml:space="preserve"> </w:t>
       </w:r>
       <w:r>
-        <w:t xml:space="preserve">16–18 days — sits inside its PAR.</w:t>
+        <w:t xml:space="preserve">16–18 days — sits inside its characterization range.</w:t>
       </w:r>
     </w:p>
     <w:bookmarkEnd w:id="32"/>
@@ -5636,7 +5636,7 @@
         <w:t xml:space="preserve"> </w:t>
       </w:r>
       <w:r>
-        <w:t xml:space="preserve">at the PAR edges, it estimates every main effect and two-factor interaction and, through its</w:t>
+        <w:t xml:space="preserve">at the characterization-range edges, it estimates every main effect and two-factor interaction and, through its</w:t>
       </w:r>
       <w:r>
         <w:t xml:space="preserve"> </w:t>
@@ -12377,13 +12377,13 @@
         <w:t xml:space="preserve"> </w:t>
       </w:r>
       <w:r>
-        <w:t xml:space="preserve">inside the proven-acceptable knowledge space. Culture pH is controlled to a NOR of</w:t>
-      </w:r>
-      <w:r>
-        <w:t xml:space="preserve"> </w:t>
-      </w:r>
-      <w:r>
-        <w:t xml:space="preserve">6.75–6.95 inside a PAR of</w:t>
+        <w:t xml:space="preserve">inside the broader knowledge space bounded by the characterization ranges. Culture pH is controlled to a NOR of</w:t>
+      </w:r>
+      <w:r>
+        <w:t xml:space="preserve"> </w:t>
+      </w:r>
+      <w:r>
+        <w:t xml:space="preserve">6.75–6.95 inside a characterization range of</w:t>
       </w:r>
       <w:r>
         <w:t xml:space="preserve"> </w:t>
@@ -12460,7 +12460,7 @@
         <w:t xml:space="preserve"> </w:t>
       </w:r>
       <w:r>
-        <w:t xml:space="preserve">beyond the PAR edges; it is a property of the four response-surface factors, with osmolality</w:t>
+        <w:t xml:space="preserve">beyond the characterization-range edges; it is a property of the four response-surface factors, with osmolality</w:t>
       </w:r>
       <w:r>
         <w:t xml:space="preserve"> </w:t>
@@ -12488,13 +12488,13 @@
       </w:r>
     </w:p>
     <w:bookmarkEnd w:id="69"/>
-    <w:bookmarkStart w:id="71" w:name="process-capability-and-robustness"/>
+    <w:bookmarkStart w:id="121" w:name="proven-acceptable-ranges"/>
     <w:p>
       <w:pPr>
         <w:pStyle w:val="Heading1"/>
       </w:pPr>
       <w:r>
-        <w:t xml:space="preserve">7. Process capability and robustness</w:t>
+        <w:t xml:space="preserve">7. Proven acceptable ranges</w:t>
       </w:r>
     </w:p>
     <w:p>
@@ -12502,30 +12502,191 @@
         <w:pStyle w:val="FirstParagraph"/>
       </w:pPr>
       <w:r>
-        <w:t xml:space="preserve">Every CQA the step forms is capable at commercial scale, with the tightest margin belonging to</w:t>
-      </w:r>
-      <w:r>
-        <w:t xml:space="preserve"> </w:t>
-      </w:r>
-      <w:r>
-        <w:t xml:space="preserve">high mannose. A Monte-Carlo simulation of 2,000 batches, with</w:t>
-      </w:r>
-      <w:r>
-        <w:t xml:space="preserve"> </w:t>
-      </w:r>
-      <w:r>
-        <w:t xml:space="preserve">the parameters varied across their normal operating ranges, propagated the culture variability</w:t>
-      </w:r>
-      <w:r>
-        <w:t xml:space="preserve"> </w:t>
-      </w:r>
-      <w:r>
-        <w:t xml:space="preserve">into each response; the resulting one-sided capability indices are given in</w:t>
-      </w:r>
-      <w:r>
-        <w:t xml:space="preserve"> </w:t>
-      </w:r>
-      <w:hyperlink w:anchor="tbl-cap">
+        <w:t xml:space="preserve">Every well-controlled culture parameter’s proven acceptable range spans its entire</w:t>
+      </w:r>
+      <w:r>
+        <w:t xml:space="preserve"> </w:t>
+      </w:r>
+      <w:r>
+        <w:t xml:space="preserve">characterization range — at set-point and under normal-operating-range co-variation alike — so</w:t>
+      </w:r>
+      <w:r>
+        <w:t xml:space="preserve"> </w:t>
+      </w:r>
+      <w:r>
+        <w:t xml:space="preserve">no single parameter’s univariate range binds the operating region; the binding constraint is the</w:t>
+      </w:r>
+      <w:r>
+        <w:t xml:space="preserve"> </w:t>
+      </w:r>
+      <w:r>
+        <w:t xml:space="preserve">multivariate design-space corner. Where the design space states the</w:t>
+      </w:r>
+      <w:r>
+        <w:t xml:space="preserve"> </w:t>
+      </w:r>
+      <w:r>
+        <w:rPr>
+          <w:i/>
+          <w:iCs/>
+        </w:rPr>
+        <w:t xml:space="preserve">joint</w:t>
+      </w:r>
+      <w:r>
+        <w:t xml:space="preserve"> </w:t>
+      </w:r>
+      <w:r>
+        <w:t xml:space="preserve">region in the four</w:t>
+      </w:r>
+      <w:r>
+        <w:t xml:space="preserve"> </w:t>
+      </w:r>
+      <w:r>
+        <w:t xml:space="preserve">response-surface factors, a proven acceptable range (PAR) states, one parameter and one CQA at a</w:t>
+      </w:r>
+      <w:r>
+        <w:t xml:space="preserve"> </w:t>
+      </w:r>
+      <w:r>
+        <w:t xml:space="preserve">time, how far that parameter may move before the CQA reaches its acceptance limit. The two views</w:t>
+      </w:r>
+      <w:r>
+        <w:t xml:space="preserve"> </w:t>
+      </w:r>
+      <w:r>
+        <w:t xml:space="preserve">are consistent, and the reason they are is the finding of this section: because each parameter is</w:t>
+      </w:r>
+      <w:r>
+        <w:t xml:space="preserve"> </w:t>
+      </w:r>
+      <w:r>
+        <w:t xml:space="preserve">individually robust across its whole studied span, what limits the region is the</w:t>
+      </w:r>
+      <w:r>
+        <w:t xml:space="preserve"> </w:t>
+      </w:r>
+      <w:r>
+        <w:rPr>
+          <w:i/>
+          <w:iCs/>
+        </w:rPr>
+        <w:t xml:space="preserve">combination</w:t>
+      </w:r>
+      <w:r>
+        <w:t xml:space="preserve"> </w:t>
+      </w:r>
+      <w:r>
+        <w:t xml:space="preserve">of</w:t>
+      </w:r>
+      <w:r>
+        <w:t xml:space="preserve"> </w:t>
+      </w:r>
+      <w:r>
+        <w:t xml:space="preserve">parameters at a worst-case corner, not any one of them alone.</w:t>
+      </w:r>
+    </w:p>
+    <w:p>
+      <w:pPr>
+        <w:pStyle w:val="BodyText"/>
+      </w:pPr>
+      <w:r>
+        <w:t xml:space="preserve">The acceptance criterion for each PAR is the study’s drug-substance specification for the CQA in</w:t>
+      </w:r>
+      <w:r>
+        <w:t xml:space="preserve"> </w:t>
+      </w:r>
+      <w:r>
+        <w:t xml:space="preserve">question — the released-glycan, size-variant and charge-variant limits of</w:t>
+      </w:r>
+      <w:r>
+        <w:t xml:space="preserve"> </w:t>
+      </w:r>
+      <w:hyperlink w:anchor="tbl-cqa">
+        <w:r>
+          <w:rPr>
+            <w:rStyle w:val="Hyperlink"/>
+          </w:rPr>
+          <w:t xml:space="preserve">Table 3</w:t>
+        </w:r>
+      </w:hyperlink>
+      <w:r>
+        <w:t xml:space="preserve"> </w:t>
+      </w:r>
+      <w:r>
+        <w:t xml:space="preserve">— applied as</w:t>
+      </w:r>
+      <w:r>
+        <w:t xml:space="preserve"> </w:t>
+      </w:r>
+      <w:r>
+        <w:t xml:space="preserve">the ceiling, floor or two-sided window the attribute must meet. A single acceptance rule resolves</w:t>
+      </w:r>
+      <w:r>
+        <w:t xml:space="preserve"> </w:t>
+      </w:r>
+      <w:r>
+        <w:t xml:space="preserve">both kinds of CQA: the drug-substance specification for an attribute the step forms, and, for a</w:t>
+      </w:r>
+      <w:r>
+        <w:t xml:space="preserve"> </w:t>
+      </w:r>
+      <w:r>
+        <w:t xml:space="preserve">viral-clearance CQA, a back-calculated step floor — the step’s required log-reduction obtained</w:t>
+      </w:r>
+      <w:r>
+        <w:t xml:space="preserve"> </w:t>
+      </w:r>
+      <w:r>
+        <w:t xml:space="preserve">from the cumulative requirement less the clearance credited to the other viral steps under the</w:t>
+      </w:r>
+      <w:r>
+        <w:t xml:space="preserve"> </w:t>
+      </w:r>
+      <w:r>
+        <w:t xml:space="preserve">process’s modular-clearance framework. The production bioreactor forms no viral-clearance CQA, so</w:t>
+      </w:r>
+      <w:r>
+        <w:t xml:space="preserve"> </w:t>
+      </w:r>
+      <w:r>
+        <w:t xml:space="preserve">that second case does not arise here; it is stated because the same rule governs the steps that do</w:t>
+      </w:r>
+      <w:r>
+        <w:t xml:space="preserve"> </w:t>
+      </w:r>
+      <w:r>
+        <w:t xml:space="preserve">set those claims (PCR-006, PCR-008, PCR-009), and because the bioreactor’s own impurity CQAs are</w:t>
+      </w:r>
+      <w:r>
+        <w:t xml:space="preserve"> </w:t>
+      </w:r>
+      <w:r>
+        <w:t xml:space="preserve">cleared downstream (PCR-005, PCR-007, PCR-008). Every PAR below is computed against the criterion</w:t>
+      </w:r>
+      <w:r>
+        <w:t xml:space="preserve"> </w:t>
+      </w:r>
+      <w:r>
+        <w:t xml:space="preserve">that rule returns, so no acceptance limit is hand-carried into this section.</w:t>
+      </w:r>
+    </w:p>
+    <w:p>
+      <w:pPr>
+        <w:pStyle w:val="BodyText"/>
+      </w:pPr>
+      <w:r>
+        <w:t xml:space="preserve">The proven acceptable ranges, computed for each of the 5 governed CQAs against</w:t>
+      </w:r>
+      <w:r>
+        <w:t xml:space="preserve"> </w:t>
+      </w:r>
+      <w:r>
+        <w:t xml:space="preserve">each of the 4 response-surface parameters, are given in</w:t>
+      </w:r>
+      <w:r>
+        <w:t xml:space="preserve"> </w:t>
+      </w:r>
+      <w:hyperlink w:anchor="tbl-par">
         <w:r>
           <w:rPr>
             <w:rStyle w:val="Hyperlink"/>
@@ -12534,7 +12695,75 @@
         </w:r>
       </w:hyperlink>
       <w:r>
-        <w:t xml:space="preserve">.</w:t>
+        <w:t xml:space="preserve">. Two ranges</w:t>
+      </w:r>
+      <w:r>
+        <w:t xml:space="preserve"> </w:t>
+      </w:r>
+      <w:r>
+        <w:t xml:space="preserve">are reported per row. The</w:t>
+      </w:r>
+      <w:r>
+        <w:t xml:space="preserve"> </w:t>
+      </w:r>
+      <w:r>
+        <w:rPr>
+          <w:i/>
+          <w:iCs/>
+        </w:rPr>
+        <w:t xml:space="preserve">at-set-point</w:t>
+      </w:r>
+      <w:r>
+        <w:t xml:space="preserve"> </w:t>
+      </w:r>
+      <w:r>
+        <w:t xml:space="preserve">PAR is the interval over which the parameter may move</w:t>
+      </w:r>
+      <w:r>
+        <w:t xml:space="preserve"> </w:t>
+      </w:r>
+      <w:r>
+        <w:t xml:space="preserve">with the other factors held at their set-points; the</w:t>
+      </w:r>
+      <w:r>
+        <w:t xml:space="preserve"> </w:t>
+      </w:r>
+      <w:r>
+        <w:rPr>
+          <w:i/>
+          <w:iCs/>
+        </w:rPr>
+        <w:t xml:space="preserve">NOR-propagated</w:t>
+      </w:r>
+      <w:r>
+        <w:t xml:space="preserve"> </w:t>
+      </w:r>
+      <w:r>
+        <w:t xml:space="preserve">PAR is the interval over</w:t>
+      </w:r>
+      <w:r>
+        <w:t xml:space="preserve"> </w:t>
+      </w:r>
+      <w:r>
+        <w:t xml:space="preserve">which the fitted response-surface model keeps the 95 % predictive interval of the CQA within</w:t>
+      </w:r>
+      <w:r>
+        <w:t xml:space="preserve"> </w:t>
+      </w:r>
+      <w:r>
+        <w:t xml:space="preserve">acceptance while the other factors vary across their normal operating ranges by Monte-Carlo — the</w:t>
+      </w:r>
+      <w:r>
+        <w:t xml:space="preserve"> </w:t>
+      </w:r>
+      <w:r>
+        <w:t xml:space="preserve">more demanding of the two, and the one carried as the reproducible default because it charges each</w:t>
+      </w:r>
+      <w:r>
+        <w:t xml:space="preserve"> </w:t>
+      </w:r>
+      <w:r>
+        <w:t xml:space="preserve">parameter’s latitude with the routine variability of the rest.</w:t>
       </w:r>
     </w:p>
     <w:tbl>
@@ -12550,7 +12779,7 @@
       <w:tr>
         <w:tc>
           <w:tcPr/>
-          <w:bookmarkStart w:id="70" w:name="tbl-cap"/>
+          <w:bookmarkStart w:id="70" w:name="tbl-par"/>
           <w:p>
             <w:pPr>
               <w:jc w:val="center"/>
@@ -12561,7 +12790,3094 @@
               <w:pStyle w:val="ImageCaption"/>
             </w:pPr>
             <w:r>
-              <w:t xml:space="preserve">Table 14: Commercial-scale process capability for the CQAs formed at the production bioreactor, from the normal-operating-range Monte-Carlo simulation.</w:t>
+              <w:t xml:space="preserve">Table 14: Proven acceptable ranges at the production bioreactor — for each governed CQA and response-surface parameter, the characterization range and both proven acceptable ranges (at set-point and NOR-propagated).</w:t>
+            </w:r>
+          </w:p>
+          <w:tbl>
+            <w:tblPr>
+              <w:tblStyle w:val="Table"/>
+              <w:tblW w:type="pct" w:w="5000"/>
+              <w:tblLayout w:type="fixed"/>
+              <w:tblLook w:firstRow="1" w:lastRow="0" w:firstColumn="0" w:lastColumn="0" w:noHBand="0" w:noVBand="0" w:val="0020"/>
+            </w:tblPr>
+            <w:tblGrid>
+              <w:gridCol w:w="1500"/>
+              <w:gridCol w:w="1834"/>
+              <w:gridCol w:w="1250"/>
+              <w:gridCol w:w="666"/>
+              <w:gridCol w:w="1584"/>
+              <w:gridCol w:w="1083"/>
+            </w:tblGrid>
+            <w:tr>
+              <w:trPr>
+                <w:tblHeader w:val="on"/>
+              </w:trPr>
+              <w:tc>
+                <w:tcPr/>
+                <w:p>
+                  <w:pPr>
+                    <w:pStyle w:val="Compact"/>
+                    <w:jc w:val="left"/>
+                    <w:jc w:val="center"/>
+                  </w:pPr>
+                  <w:r>
+                    <w:t xml:space="preserve">CQA</w:t>
+                  </w:r>
+                </w:p>
+              </w:tc>
+              <w:tc>
+                <w:tcPr/>
+                <w:p>
+                  <w:pPr>
+                    <w:pStyle w:val="Compact"/>
+                    <w:jc w:val="left"/>
+                    <w:jc w:val="center"/>
+                  </w:pPr>
+                  <w:r>
+                    <w:t xml:space="preserve">Parameter</w:t>
+                  </w:r>
+                </w:p>
+              </w:tc>
+              <w:tc>
+                <w:tcPr/>
+                <w:p>
+                  <w:pPr>
+                    <w:pStyle w:val="Compact"/>
+                    <w:jc w:val="left"/>
+                    <w:jc w:val="center"/>
+                  </w:pPr>
+                  <w:r>
+                    <w:t xml:space="preserve">Char. range</w:t>
+                  </w:r>
+                </w:p>
+              </w:tc>
+              <w:tc>
+                <w:tcPr/>
+                <w:p>
+                  <w:pPr>
+                    <w:pStyle w:val="Compact"/>
+                    <w:jc w:val="left"/>
+                    <w:jc w:val="center"/>
+                  </w:pPr>
+                  <w:r>
+                    <w:t xml:space="preserve">Unit</w:t>
+                  </w:r>
+                </w:p>
+              </w:tc>
+              <w:tc>
+                <w:tcPr/>
+                <w:p>
+                  <w:pPr>
+                    <w:pStyle w:val="Compact"/>
+                    <w:jc w:val="left"/>
+                    <w:jc w:val="center"/>
+                  </w:pPr>
+                  <w:r>
+                    <w:t xml:space="preserve">PAR (set-point)</w:t>
+                  </w:r>
+                </w:p>
+              </w:tc>
+              <w:tc>
+                <w:tcPr/>
+                <w:p>
+                  <w:pPr>
+                    <w:pStyle w:val="Compact"/>
+                    <w:jc w:val="left"/>
+                    <w:jc w:val="center"/>
+                  </w:pPr>
+                  <w:r>
+                    <w:t xml:space="preserve">PAR (NOR)</w:t>
+                  </w:r>
+                </w:p>
+              </w:tc>
+            </w:tr>
+            <w:tr>
+              <w:tc>
+                <w:tcPr/>
+                <w:p>
+                  <w:pPr>
+                    <w:pStyle w:val="Compact"/>
+                    <w:jc w:val="left"/>
+                    <w:jc w:val="center"/>
+                  </w:pPr>
+                  <w:r>
+                    <w:t xml:space="preserve">Afucosylation</w:t>
+                  </w:r>
+                </w:p>
+              </w:tc>
+              <w:tc>
+                <w:tcPr/>
+                <w:p>
+                  <w:pPr>
+                    <w:pStyle w:val="Compact"/>
+                    <w:jc w:val="left"/>
+                    <w:jc w:val="center"/>
+                  </w:pPr>
+                  <w:r>
+                    <w:t xml:space="preserve">Culture pH</w:t>
+                  </w:r>
+                </w:p>
+              </w:tc>
+              <w:tc>
+                <w:tcPr/>
+                <w:p>
+                  <w:pPr>
+                    <w:pStyle w:val="Compact"/>
+                    <w:jc w:val="left"/>
+                    <w:jc w:val="center"/>
+                  </w:pPr>
+                  <w:r>
+                    <w:t xml:space="preserve">6.6–7.1</w:t>
+                  </w:r>
+                </w:p>
+              </w:tc>
+              <w:tc>
+                <w:tcPr/>
+                <w:p>
+                  <w:pPr>
+                    <w:pStyle w:val="Compact"/>
+                    <w:jc w:val="left"/>
+                    <w:jc w:val="center"/>
+                  </w:pPr>
+                  <w:r>
+                    <w:t xml:space="preserve">pH</w:t>
+                  </w:r>
+                </w:p>
+              </w:tc>
+              <w:tc>
+                <w:tcPr/>
+                <w:p>
+                  <w:pPr>
+                    <w:pStyle w:val="Compact"/>
+                    <w:jc w:val="left"/>
+                    <w:jc w:val="center"/>
+                  </w:pPr>
+                  <w:r>
+                    <w:t xml:space="preserve">6.6–7.1</w:t>
+                  </w:r>
+                </w:p>
+              </w:tc>
+              <w:tc>
+                <w:tcPr/>
+                <w:p>
+                  <w:pPr>
+                    <w:pStyle w:val="Compact"/>
+                    <w:jc w:val="left"/>
+                    <w:jc w:val="center"/>
+                  </w:pPr>
+                  <w:r>
+                    <w:t xml:space="preserve">6.6–7.1</w:t>
+                  </w:r>
+                </w:p>
+              </w:tc>
+            </w:tr>
+            <w:tr>
+              <w:tc>
+                <w:tcPr/>
+                <w:p>
+                  <w:pPr>
+                    <w:pStyle w:val="Compact"/>
+                    <w:jc w:val="left"/>
+                    <w:jc w:val="center"/>
+                  </w:pPr>
+                  <w:r>
+                    <w:t xml:space="preserve">Afucosylation</w:t>
+                  </w:r>
+                </w:p>
+              </w:tc>
+              <w:tc>
+                <w:tcPr/>
+                <w:p>
+                  <w:pPr>
+                    <w:pStyle w:val="Compact"/>
+                    <w:jc w:val="left"/>
+                    <w:jc w:val="center"/>
+                  </w:pPr>
+                  <w:r>
+                    <w:t xml:space="preserve">Culture temperature</w:t>
+                  </w:r>
+                </w:p>
+              </w:tc>
+              <w:tc>
+                <w:tcPr/>
+                <w:p>
+                  <w:pPr>
+                    <w:pStyle w:val="Compact"/>
+                    <w:jc w:val="left"/>
+                    <w:jc w:val="center"/>
+                  </w:pPr>
+                  <w:r>
+                    <w:t xml:space="preserve">34–36</w:t>
+                  </w:r>
+                </w:p>
+              </w:tc>
+              <w:tc>
+                <w:tcPr/>
+                <w:p>
+                  <w:pPr>
+                    <w:pStyle w:val="Compact"/>
+                    <w:jc w:val="left"/>
+                    <w:jc w:val="center"/>
+                  </w:pPr>
+                  <w:r>
+                    <w:t xml:space="preserve">°C</w:t>
+                  </w:r>
+                </w:p>
+              </w:tc>
+              <w:tc>
+                <w:tcPr/>
+                <w:p>
+                  <w:pPr>
+                    <w:pStyle w:val="Compact"/>
+                    <w:jc w:val="left"/>
+                    <w:jc w:val="center"/>
+                  </w:pPr>
+                  <w:r>
+                    <w:t xml:space="preserve">34–36</w:t>
+                  </w:r>
+                </w:p>
+              </w:tc>
+              <w:tc>
+                <w:tcPr/>
+                <w:p>
+                  <w:pPr>
+                    <w:pStyle w:val="Compact"/>
+                    <w:jc w:val="left"/>
+                    <w:jc w:val="center"/>
+                  </w:pPr>
+                  <w:r>
+                    <w:t xml:space="preserve">34–36</w:t>
+                  </w:r>
+                </w:p>
+              </w:tc>
+            </w:tr>
+            <w:tr>
+              <w:tc>
+                <w:tcPr/>
+                <w:p>
+                  <w:pPr>
+                    <w:pStyle w:val="Compact"/>
+                    <w:jc w:val="left"/>
+                    <w:jc w:val="center"/>
+                  </w:pPr>
+                  <w:r>
+                    <w:t xml:space="preserve">Afucosylation</w:t>
+                  </w:r>
+                </w:p>
+              </w:tc>
+              <w:tc>
+                <w:tcPr/>
+                <w:p>
+                  <w:pPr>
+                    <w:pStyle w:val="Compact"/>
+                    <w:jc w:val="left"/>
+                    <w:jc w:val="center"/>
+                  </w:pPr>
+                  <w:r>
+                    <w:t xml:space="preserve">Culture duration</w:t>
+                  </w:r>
+                </w:p>
+              </w:tc>
+              <w:tc>
+                <w:tcPr/>
+                <w:p>
+                  <w:pPr>
+                    <w:pStyle w:val="Compact"/>
+                    <w:jc w:val="left"/>
+                    <w:jc w:val="center"/>
+                  </w:pPr>
+                  <w:r>
+                    <w:t xml:space="preserve">15–19</w:t>
+                  </w:r>
+                </w:p>
+              </w:tc>
+              <w:tc>
+                <w:tcPr/>
+                <w:p>
+                  <w:pPr>
+                    <w:pStyle w:val="Compact"/>
+                    <w:jc w:val="left"/>
+                    <w:jc w:val="center"/>
+                  </w:pPr>
+                  <w:r>
+                    <w:t xml:space="preserve">days</w:t>
+                  </w:r>
+                </w:p>
+              </w:tc>
+              <w:tc>
+                <w:tcPr/>
+                <w:p>
+                  <w:pPr>
+                    <w:pStyle w:val="Compact"/>
+                    <w:jc w:val="left"/>
+                    <w:jc w:val="center"/>
+                  </w:pPr>
+                  <w:r>
+                    <w:t xml:space="preserve">15–19</w:t>
+                  </w:r>
+                </w:p>
+              </w:tc>
+              <w:tc>
+                <w:tcPr/>
+                <w:p>
+                  <w:pPr>
+                    <w:pStyle w:val="Compact"/>
+                    <w:jc w:val="left"/>
+                    <w:jc w:val="center"/>
+                  </w:pPr>
+                  <w:r>
+                    <w:t xml:space="preserve">15–19</w:t>
+                  </w:r>
+                </w:p>
+              </w:tc>
+            </w:tr>
+            <w:tr>
+              <w:tc>
+                <w:tcPr/>
+                <w:p>
+                  <w:pPr>
+                    <w:pStyle w:val="Compact"/>
+                    <w:jc w:val="left"/>
+                    <w:jc w:val="center"/>
+                  </w:pPr>
+                  <w:r>
+                    <w:t xml:space="preserve">Afucosylation</w:t>
+                  </w:r>
+                </w:p>
+              </w:tc>
+              <w:tc>
+                <w:tcPr/>
+                <w:p>
+                  <w:pPr>
+                    <w:pStyle w:val="Compact"/>
+                    <w:jc w:val="left"/>
+                    <w:jc w:val="center"/>
+                  </w:pPr>
+                  <w:r>
+                    <w:t xml:space="preserve">Dissolved CO2 (pCO2)</w:t>
+                  </w:r>
+                </w:p>
+              </w:tc>
+              <w:tc>
+                <w:tcPr/>
+                <w:p>
+                  <w:pPr>
+                    <w:pStyle w:val="Compact"/>
+                    <w:jc w:val="left"/>
+                    <w:jc w:val="center"/>
+                  </w:pPr>
+                  <w:r>
+                    <w:t xml:space="preserve">40–160</w:t>
+                  </w:r>
+                </w:p>
+              </w:tc>
+              <w:tc>
+                <w:tcPr/>
+                <w:p>
+                  <w:pPr>
+                    <w:pStyle w:val="Compact"/>
+                    <w:jc w:val="left"/>
+                    <w:jc w:val="center"/>
+                  </w:pPr>
+                  <w:r>
+                    <w:t xml:space="preserve">mmHg</w:t>
+                  </w:r>
+                </w:p>
+              </w:tc>
+              <w:tc>
+                <w:tcPr/>
+                <w:p>
+                  <w:pPr>
+                    <w:pStyle w:val="Compact"/>
+                    <w:jc w:val="left"/>
+                    <w:jc w:val="center"/>
+                  </w:pPr>
+                  <w:r>
+                    <w:t xml:space="preserve">40–160</w:t>
+                  </w:r>
+                </w:p>
+              </w:tc>
+              <w:tc>
+                <w:tcPr/>
+                <w:p>
+                  <w:pPr>
+                    <w:pStyle w:val="Compact"/>
+                    <w:jc w:val="left"/>
+                    <w:jc w:val="center"/>
+                  </w:pPr>
+                  <w:r>
+                    <w:t xml:space="preserve">40–160</w:t>
+                  </w:r>
+                </w:p>
+              </w:tc>
+            </w:tr>
+            <w:tr>
+              <w:tc>
+                <w:tcPr/>
+                <w:p>
+                  <w:pPr>
+                    <w:pStyle w:val="Compact"/>
+                    <w:jc w:val="left"/>
+                    <w:jc w:val="center"/>
+                  </w:pPr>
+                  <w:r>
+                    <w:t xml:space="preserve">Galactosylation</w:t>
+                  </w:r>
+                </w:p>
+              </w:tc>
+              <w:tc>
+                <w:tcPr/>
+                <w:p>
+                  <w:pPr>
+                    <w:pStyle w:val="Compact"/>
+                    <w:jc w:val="left"/>
+                    <w:jc w:val="center"/>
+                  </w:pPr>
+                  <w:r>
+                    <w:t xml:space="preserve">Culture pH</w:t>
+                  </w:r>
+                </w:p>
+              </w:tc>
+              <w:tc>
+                <w:tcPr/>
+                <w:p>
+                  <w:pPr>
+                    <w:pStyle w:val="Compact"/>
+                    <w:jc w:val="left"/>
+                    <w:jc w:val="center"/>
+                  </w:pPr>
+                  <w:r>
+                    <w:t xml:space="preserve">6.6–7.1</w:t>
+                  </w:r>
+                </w:p>
+              </w:tc>
+              <w:tc>
+                <w:tcPr/>
+                <w:p>
+                  <w:pPr>
+                    <w:pStyle w:val="Compact"/>
+                    <w:jc w:val="left"/>
+                    <w:jc w:val="center"/>
+                  </w:pPr>
+                  <w:r>
+                    <w:t xml:space="preserve">pH</w:t>
+                  </w:r>
+                </w:p>
+              </w:tc>
+              <w:tc>
+                <w:tcPr/>
+                <w:p>
+                  <w:pPr>
+                    <w:pStyle w:val="Compact"/>
+                    <w:jc w:val="left"/>
+                    <w:jc w:val="center"/>
+                  </w:pPr>
+                  <w:r>
+                    <w:t xml:space="preserve">6.6–7.1</w:t>
+                  </w:r>
+                </w:p>
+              </w:tc>
+              <w:tc>
+                <w:tcPr/>
+                <w:p>
+                  <w:pPr>
+                    <w:pStyle w:val="Compact"/>
+                    <w:jc w:val="left"/>
+                    <w:jc w:val="center"/>
+                  </w:pPr>
+                  <w:r>
+                    <w:t xml:space="preserve">6.6–7.1</w:t>
+                  </w:r>
+                </w:p>
+              </w:tc>
+            </w:tr>
+            <w:tr>
+              <w:tc>
+                <w:tcPr/>
+                <w:p>
+                  <w:pPr>
+                    <w:pStyle w:val="Compact"/>
+                    <w:jc w:val="left"/>
+                    <w:jc w:val="center"/>
+                  </w:pPr>
+                  <w:r>
+                    <w:t xml:space="preserve">Galactosylation</w:t>
+                  </w:r>
+                </w:p>
+              </w:tc>
+              <w:tc>
+                <w:tcPr/>
+                <w:p>
+                  <w:pPr>
+                    <w:pStyle w:val="Compact"/>
+                    <w:jc w:val="left"/>
+                    <w:jc w:val="center"/>
+                  </w:pPr>
+                  <w:r>
+                    <w:t xml:space="preserve">Culture temperature</w:t>
+                  </w:r>
+                </w:p>
+              </w:tc>
+              <w:tc>
+                <w:tcPr/>
+                <w:p>
+                  <w:pPr>
+                    <w:pStyle w:val="Compact"/>
+                    <w:jc w:val="left"/>
+                    <w:jc w:val="center"/>
+                  </w:pPr>
+                  <w:r>
+                    <w:t xml:space="preserve">34–36</w:t>
+                  </w:r>
+                </w:p>
+              </w:tc>
+              <w:tc>
+                <w:tcPr/>
+                <w:p>
+                  <w:pPr>
+                    <w:pStyle w:val="Compact"/>
+                    <w:jc w:val="left"/>
+                    <w:jc w:val="center"/>
+                  </w:pPr>
+                  <w:r>
+                    <w:t xml:space="preserve">°C</w:t>
+                  </w:r>
+                </w:p>
+              </w:tc>
+              <w:tc>
+                <w:tcPr/>
+                <w:p>
+                  <w:pPr>
+                    <w:pStyle w:val="Compact"/>
+                    <w:jc w:val="left"/>
+                    <w:jc w:val="center"/>
+                  </w:pPr>
+                  <w:r>
+                    <w:t xml:space="preserve">34–36</w:t>
+                  </w:r>
+                </w:p>
+              </w:tc>
+              <w:tc>
+                <w:tcPr/>
+                <w:p>
+                  <w:pPr>
+                    <w:pStyle w:val="Compact"/>
+                    <w:jc w:val="left"/>
+                    <w:jc w:val="center"/>
+                  </w:pPr>
+                  <w:r>
+                    <w:t xml:space="preserve">34–36</w:t>
+                  </w:r>
+                </w:p>
+              </w:tc>
+            </w:tr>
+            <w:tr>
+              <w:tc>
+                <w:tcPr/>
+                <w:p>
+                  <w:pPr>
+                    <w:pStyle w:val="Compact"/>
+                    <w:jc w:val="left"/>
+                    <w:jc w:val="center"/>
+                  </w:pPr>
+                  <w:r>
+                    <w:t xml:space="preserve">Galactosylation</w:t>
+                  </w:r>
+                </w:p>
+              </w:tc>
+              <w:tc>
+                <w:tcPr/>
+                <w:p>
+                  <w:pPr>
+                    <w:pStyle w:val="Compact"/>
+                    <w:jc w:val="left"/>
+                    <w:jc w:val="center"/>
+                  </w:pPr>
+                  <w:r>
+                    <w:t xml:space="preserve">Culture duration</w:t>
+                  </w:r>
+                </w:p>
+              </w:tc>
+              <w:tc>
+                <w:tcPr/>
+                <w:p>
+                  <w:pPr>
+                    <w:pStyle w:val="Compact"/>
+                    <w:jc w:val="left"/>
+                    <w:jc w:val="center"/>
+                  </w:pPr>
+                  <w:r>
+                    <w:t xml:space="preserve">15–19</w:t>
+                  </w:r>
+                </w:p>
+              </w:tc>
+              <w:tc>
+                <w:tcPr/>
+                <w:p>
+                  <w:pPr>
+                    <w:pStyle w:val="Compact"/>
+                    <w:jc w:val="left"/>
+                    <w:jc w:val="center"/>
+                  </w:pPr>
+                  <w:r>
+                    <w:t xml:space="preserve">days</w:t>
+                  </w:r>
+                </w:p>
+              </w:tc>
+              <w:tc>
+                <w:tcPr/>
+                <w:p>
+                  <w:pPr>
+                    <w:pStyle w:val="Compact"/>
+                    <w:jc w:val="left"/>
+                    <w:jc w:val="center"/>
+                  </w:pPr>
+                  <w:r>
+                    <w:t xml:space="preserve">15–19</w:t>
+                  </w:r>
+                </w:p>
+              </w:tc>
+              <w:tc>
+                <w:tcPr/>
+                <w:p>
+                  <w:pPr>
+                    <w:pStyle w:val="Compact"/>
+                    <w:jc w:val="left"/>
+                    <w:jc w:val="center"/>
+                  </w:pPr>
+                  <w:r>
+                    <w:t xml:space="preserve">15–19</w:t>
+                  </w:r>
+                </w:p>
+              </w:tc>
+            </w:tr>
+            <w:tr>
+              <w:tc>
+                <w:tcPr/>
+                <w:p>
+                  <w:pPr>
+                    <w:pStyle w:val="Compact"/>
+                    <w:jc w:val="left"/>
+                    <w:jc w:val="center"/>
+                  </w:pPr>
+                  <w:r>
+                    <w:t xml:space="preserve">Galactosylation</w:t>
+                  </w:r>
+                </w:p>
+              </w:tc>
+              <w:tc>
+                <w:tcPr/>
+                <w:p>
+                  <w:pPr>
+                    <w:pStyle w:val="Compact"/>
+                    <w:jc w:val="left"/>
+                    <w:jc w:val="center"/>
+                  </w:pPr>
+                  <w:r>
+                    <w:t xml:space="preserve">Dissolved CO2 (pCO2)</w:t>
+                  </w:r>
+                </w:p>
+              </w:tc>
+              <w:tc>
+                <w:tcPr/>
+                <w:p>
+                  <w:pPr>
+                    <w:pStyle w:val="Compact"/>
+                    <w:jc w:val="left"/>
+                    <w:jc w:val="center"/>
+                  </w:pPr>
+                  <w:r>
+                    <w:t xml:space="preserve">40–160</w:t>
+                  </w:r>
+                </w:p>
+              </w:tc>
+              <w:tc>
+                <w:tcPr/>
+                <w:p>
+                  <w:pPr>
+                    <w:pStyle w:val="Compact"/>
+                    <w:jc w:val="left"/>
+                    <w:jc w:val="center"/>
+                  </w:pPr>
+                  <w:r>
+                    <w:t xml:space="preserve">mmHg</w:t>
+                  </w:r>
+                </w:p>
+              </w:tc>
+              <w:tc>
+                <w:tcPr/>
+                <w:p>
+                  <w:pPr>
+                    <w:pStyle w:val="Compact"/>
+                    <w:jc w:val="left"/>
+                    <w:jc w:val="center"/>
+                  </w:pPr>
+                  <w:r>
+                    <w:t xml:space="preserve">40–160</w:t>
+                  </w:r>
+                </w:p>
+              </w:tc>
+              <w:tc>
+                <w:tcPr/>
+                <w:p>
+                  <w:pPr>
+                    <w:pStyle w:val="Compact"/>
+                    <w:jc w:val="left"/>
+                    <w:jc w:val="center"/>
+                  </w:pPr>
+                  <w:r>
+                    <w:t xml:space="preserve">40–160</w:t>
+                  </w:r>
+                </w:p>
+              </w:tc>
+            </w:tr>
+            <w:tr>
+              <w:tc>
+                <w:tcPr/>
+                <w:p>
+                  <w:pPr>
+                    <w:pStyle w:val="Compact"/>
+                    <w:jc w:val="left"/>
+                    <w:jc w:val="center"/>
+                  </w:pPr>
+                  <w:r>
+                    <w:t xml:space="preserve">High mannose</w:t>
+                  </w:r>
+                </w:p>
+              </w:tc>
+              <w:tc>
+                <w:tcPr/>
+                <w:p>
+                  <w:pPr>
+                    <w:pStyle w:val="Compact"/>
+                    <w:jc w:val="left"/>
+                    <w:jc w:val="center"/>
+                  </w:pPr>
+                  <w:r>
+                    <w:t xml:space="preserve">Culture pH</w:t>
+                  </w:r>
+                </w:p>
+              </w:tc>
+              <w:tc>
+                <w:tcPr/>
+                <w:p>
+                  <w:pPr>
+                    <w:pStyle w:val="Compact"/>
+                    <w:jc w:val="left"/>
+                    <w:jc w:val="center"/>
+                  </w:pPr>
+                  <w:r>
+                    <w:t xml:space="preserve">6.6–7.1</w:t>
+                  </w:r>
+                </w:p>
+              </w:tc>
+              <w:tc>
+                <w:tcPr/>
+                <w:p>
+                  <w:pPr>
+                    <w:pStyle w:val="Compact"/>
+                    <w:jc w:val="left"/>
+                    <w:jc w:val="center"/>
+                  </w:pPr>
+                  <w:r>
+                    <w:t xml:space="preserve">pH</w:t>
+                  </w:r>
+                </w:p>
+              </w:tc>
+              <w:tc>
+                <w:tcPr/>
+                <w:p>
+                  <w:pPr>
+                    <w:pStyle w:val="Compact"/>
+                    <w:jc w:val="left"/>
+                    <w:jc w:val="center"/>
+                  </w:pPr>
+                  <w:r>
+                    <w:t xml:space="preserve">6.6–7.1</w:t>
+                  </w:r>
+                </w:p>
+              </w:tc>
+              <w:tc>
+                <w:tcPr/>
+                <w:p>
+                  <w:pPr>
+                    <w:pStyle w:val="Compact"/>
+                    <w:jc w:val="left"/>
+                    <w:jc w:val="center"/>
+                  </w:pPr>
+                  <w:r>
+                    <w:t xml:space="preserve">6.6–7.1</w:t>
+                  </w:r>
+                </w:p>
+              </w:tc>
+            </w:tr>
+            <w:tr>
+              <w:tc>
+                <w:tcPr/>
+                <w:p>
+                  <w:pPr>
+                    <w:pStyle w:val="Compact"/>
+                    <w:jc w:val="left"/>
+                    <w:jc w:val="center"/>
+                  </w:pPr>
+                  <w:r>
+                    <w:t xml:space="preserve">High mannose</w:t>
+                  </w:r>
+                </w:p>
+              </w:tc>
+              <w:tc>
+                <w:tcPr/>
+                <w:p>
+                  <w:pPr>
+                    <w:pStyle w:val="Compact"/>
+                    <w:jc w:val="left"/>
+                    <w:jc w:val="center"/>
+                  </w:pPr>
+                  <w:r>
+                    <w:t xml:space="preserve">Culture temperature</w:t>
+                  </w:r>
+                </w:p>
+              </w:tc>
+              <w:tc>
+                <w:tcPr/>
+                <w:p>
+                  <w:pPr>
+                    <w:pStyle w:val="Compact"/>
+                    <w:jc w:val="left"/>
+                    <w:jc w:val="center"/>
+                  </w:pPr>
+                  <w:r>
+                    <w:t xml:space="preserve">34–36</w:t>
+                  </w:r>
+                </w:p>
+              </w:tc>
+              <w:tc>
+                <w:tcPr/>
+                <w:p>
+                  <w:pPr>
+                    <w:pStyle w:val="Compact"/>
+                    <w:jc w:val="left"/>
+                    <w:jc w:val="center"/>
+                  </w:pPr>
+                  <w:r>
+                    <w:t xml:space="preserve">°C</w:t>
+                  </w:r>
+                </w:p>
+              </w:tc>
+              <w:tc>
+                <w:tcPr/>
+                <w:p>
+                  <w:pPr>
+                    <w:pStyle w:val="Compact"/>
+                    <w:jc w:val="left"/>
+                    <w:jc w:val="center"/>
+                  </w:pPr>
+                  <w:r>
+                    <w:t xml:space="preserve">34–36</w:t>
+                  </w:r>
+                </w:p>
+              </w:tc>
+              <w:tc>
+                <w:tcPr/>
+                <w:p>
+                  <w:pPr>
+                    <w:pStyle w:val="Compact"/>
+                    <w:jc w:val="left"/>
+                    <w:jc w:val="center"/>
+                  </w:pPr>
+                  <w:r>
+                    <w:t xml:space="preserve">34–36</w:t>
+                  </w:r>
+                </w:p>
+              </w:tc>
+            </w:tr>
+            <w:tr>
+              <w:tc>
+                <w:tcPr/>
+                <w:p>
+                  <w:pPr>
+                    <w:pStyle w:val="Compact"/>
+                    <w:jc w:val="left"/>
+                    <w:jc w:val="center"/>
+                  </w:pPr>
+                  <w:r>
+                    <w:t xml:space="preserve">High mannose</w:t>
+                  </w:r>
+                </w:p>
+              </w:tc>
+              <w:tc>
+                <w:tcPr/>
+                <w:p>
+                  <w:pPr>
+                    <w:pStyle w:val="Compact"/>
+                    <w:jc w:val="left"/>
+                    <w:jc w:val="center"/>
+                  </w:pPr>
+                  <w:r>
+                    <w:t xml:space="preserve">Culture duration</w:t>
+                  </w:r>
+                </w:p>
+              </w:tc>
+              <w:tc>
+                <w:tcPr/>
+                <w:p>
+                  <w:pPr>
+                    <w:pStyle w:val="Compact"/>
+                    <w:jc w:val="left"/>
+                    <w:jc w:val="center"/>
+                  </w:pPr>
+                  <w:r>
+                    <w:t xml:space="preserve">15–19</w:t>
+                  </w:r>
+                </w:p>
+              </w:tc>
+              <w:tc>
+                <w:tcPr/>
+                <w:p>
+                  <w:pPr>
+                    <w:pStyle w:val="Compact"/>
+                    <w:jc w:val="left"/>
+                    <w:jc w:val="center"/>
+                  </w:pPr>
+                  <w:r>
+                    <w:t xml:space="preserve">days</w:t>
+                  </w:r>
+                </w:p>
+              </w:tc>
+              <w:tc>
+                <w:tcPr/>
+                <w:p>
+                  <w:pPr>
+                    <w:pStyle w:val="Compact"/>
+                    <w:jc w:val="left"/>
+                    <w:jc w:val="center"/>
+                  </w:pPr>
+                  <w:r>
+                    <w:t xml:space="preserve">15–19</w:t>
+                  </w:r>
+                </w:p>
+              </w:tc>
+              <w:tc>
+                <w:tcPr/>
+                <w:p>
+                  <w:pPr>
+                    <w:pStyle w:val="Compact"/>
+                    <w:jc w:val="left"/>
+                    <w:jc w:val="center"/>
+                  </w:pPr>
+                  <w:r>
+                    <w:t xml:space="preserve">15–19</w:t>
+                  </w:r>
+                </w:p>
+              </w:tc>
+            </w:tr>
+            <w:tr>
+              <w:tc>
+                <w:tcPr/>
+                <w:p>
+                  <w:pPr>
+                    <w:pStyle w:val="Compact"/>
+                    <w:jc w:val="left"/>
+                    <w:jc w:val="center"/>
+                  </w:pPr>
+                  <w:r>
+                    <w:t xml:space="preserve">High mannose</w:t>
+                  </w:r>
+                </w:p>
+              </w:tc>
+              <w:tc>
+                <w:tcPr/>
+                <w:p>
+                  <w:pPr>
+                    <w:pStyle w:val="Compact"/>
+                    <w:jc w:val="left"/>
+                    <w:jc w:val="center"/>
+                  </w:pPr>
+                  <w:r>
+                    <w:t xml:space="preserve">Dissolved CO2 (pCO2)</w:t>
+                  </w:r>
+                </w:p>
+              </w:tc>
+              <w:tc>
+                <w:tcPr/>
+                <w:p>
+                  <w:pPr>
+                    <w:pStyle w:val="Compact"/>
+                    <w:jc w:val="left"/>
+                    <w:jc w:val="center"/>
+                  </w:pPr>
+                  <w:r>
+                    <w:t xml:space="preserve">40–160</w:t>
+                  </w:r>
+                </w:p>
+              </w:tc>
+              <w:tc>
+                <w:tcPr/>
+                <w:p>
+                  <w:pPr>
+                    <w:pStyle w:val="Compact"/>
+                    <w:jc w:val="left"/>
+                    <w:jc w:val="center"/>
+                  </w:pPr>
+                  <w:r>
+                    <w:t xml:space="preserve">mmHg</w:t>
+                  </w:r>
+                </w:p>
+              </w:tc>
+              <w:tc>
+                <w:tcPr/>
+                <w:p>
+                  <w:pPr>
+                    <w:pStyle w:val="Compact"/>
+                    <w:jc w:val="left"/>
+                    <w:jc w:val="center"/>
+                  </w:pPr>
+                  <w:r>
+                    <w:t xml:space="preserve">40–160</w:t>
+                  </w:r>
+                </w:p>
+              </w:tc>
+              <w:tc>
+                <w:tcPr/>
+                <w:p>
+                  <w:pPr>
+                    <w:pStyle w:val="Compact"/>
+                    <w:jc w:val="left"/>
+                    <w:jc w:val="center"/>
+                  </w:pPr>
+                  <w:r>
+                    <w:t xml:space="preserve">40–160</w:t>
+                  </w:r>
+                </w:p>
+              </w:tc>
+            </w:tr>
+            <w:tr>
+              <w:tc>
+                <w:tcPr/>
+                <w:p>
+                  <w:pPr>
+                    <w:pStyle w:val="Compact"/>
+                    <w:jc w:val="left"/>
+                    <w:jc w:val="center"/>
+                  </w:pPr>
+                  <w:r>
+                    <w:t xml:space="preserve">Acidic variants</w:t>
+                  </w:r>
+                </w:p>
+              </w:tc>
+              <w:tc>
+                <w:tcPr/>
+                <w:p>
+                  <w:pPr>
+                    <w:pStyle w:val="Compact"/>
+                    <w:jc w:val="left"/>
+                    <w:jc w:val="center"/>
+                  </w:pPr>
+                  <w:r>
+                    <w:t xml:space="preserve">Culture pH</w:t>
+                  </w:r>
+                </w:p>
+              </w:tc>
+              <w:tc>
+                <w:tcPr/>
+                <w:p>
+                  <w:pPr>
+                    <w:pStyle w:val="Compact"/>
+                    <w:jc w:val="left"/>
+                    <w:jc w:val="center"/>
+                  </w:pPr>
+                  <w:r>
+                    <w:t xml:space="preserve">6.6–7.1</w:t>
+                  </w:r>
+                </w:p>
+              </w:tc>
+              <w:tc>
+                <w:tcPr/>
+                <w:p>
+                  <w:pPr>
+                    <w:pStyle w:val="Compact"/>
+                    <w:jc w:val="left"/>
+                    <w:jc w:val="center"/>
+                  </w:pPr>
+                  <w:r>
+                    <w:t xml:space="preserve">pH</w:t>
+                  </w:r>
+                </w:p>
+              </w:tc>
+              <w:tc>
+                <w:tcPr/>
+                <w:p>
+                  <w:pPr>
+                    <w:pStyle w:val="Compact"/>
+                    <w:jc w:val="left"/>
+                    <w:jc w:val="center"/>
+                  </w:pPr>
+                  <w:r>
+                    <w:t xml:space="preserve">6.6–7.1</w:t>
+                  </w:r>
+                </w:p>
+              </w:tc>
+              <w:tc>
+                <w:tcPr/>
+                <w:p>
+                  <w:pPr>
+                    <w:pStyle w:val="Compact"/>
+                    <w:jc w:val="left"/>
+                    <w:jc w:val="center"/>
+                  </w:pPr>
+                  <w:r>
+                    <w:t xml:space="preserve">6.6–7.1</w:t>
+                  </w:r>
+                </w:p>
+              </w:tc>
+            </w:tr>
+            <w:tr>
+              <w:tc>
+                <w:tcPr/>
+                <w:p>
+                  <w:pPr>
+                    <w:pStyle w:val="Compact"/>
+                    <w:jc w:val="left"/>
+                    <w:jc w:val="center"/>
+                  </w:pPr>
+                  <w:r>
+                    <w:t xml:space="preserve">Acidic variants</w:t>
+                  </w:r>
+                </w:p>
+              </w:tc>
+              <w:tc>
+                <w:tcPr/>
+                <w:p>
+                  <w:pPr>
+                    <w:pStyle w:val="Compact"/>
+                    <w:jc w:val="left"/>
+                    <w:jc w:val="center"/>
+                  </w:pPr>
+                  <w:r>
+                    <w:t xml:space="preserve">Culture temperature</w:t>
+                  </w:r>
+                </w:p>
+              </w:tc>
+              <w:tc>
+                <w:tcPr/>
+                <w:p>
+                  <w:pPr>
+                    <w:pStyle w:val="Compact"/>
+                    <w:jc w:val="left"/>
+                    <w:jc w:val="center"/>
+                  </w:pPr>
+                  <w:r>
+                    <w:t xml:space="preserve">34–36</w:t>
+                  </w:r>
+                </w:p>
+              </w:tc>
+              <w:tc>
+                <w:tcPr/>
+                <w:p>
+                  <w:pPr>
+                    <w:pStyle w:val="Compact"/>
+                    <w:jc w:val="left"/>
+                    <w:jc w:val="center"/>
+                  </w:pPr>
+                  <w:r>
+                    <w:t xml:space="preserve">°C</w:t>
+                  </w:r>
+                </w:p>
+              </w:tc>
+              <w:tc>
+                <w:tcPr/>
+                <w:p>
+                  <w:pPr>
+                    <w:pStyle w:val="Compact"/>
+                    <w:jc w:val="left"/>
+                    <w:jc w:val="center"/>
+                  </w:pPr>
+                  <w:r>
+                    <w:t xml:space="preserve">34–36</w:t>
+                  </w:r>
+                </w:p>
+              </w:tc>
+              <w:tc>
+                <w:tcPr/>
+                <w:p>
+                  <w:pPr>
+                    <w:pStyle w:val="Compact"/>
+                    <w:jc w:val="left"/>
+                    <w:jc w:val="center"/>
+                  </w:pPr>
+                  <w:r>
+                    <w:t xml:space="preserve">34–36</w:t>
+                  </w:r>
+                </w:p>
+              </w:tc>
+            </w:tr>
+            <w:tr>
+              <w:tc>
+                <w:tcPr/>
+                <w:p>
+                  <w:pPr>
+                    <w:pStyle w:val="Compact"/>
+                    <w:jc w:val="left"/>
+                    <w:jc w:val="center"/>
+                  </w:pPr>
+                  <w:r>
+                    <w:t xml:space="preserve">Acidic variants</w:t>
+                  </w:r>
+                </w:p>
+              </w:tc>
+              <w:tc>
+                <w:tcPr/>
+                <w:p>
+                  <w:pPr>
+                    <w:pStyle w:val="Compact"/>
+                    <w:jc w:val="left"/>
+                    <w:jc w:val="center"/>
+                  </w:pPr>
+                  <w:r>
+                    <w:t xml:space="preserve">Culture duration</w:t>
+                  </w:r>
+                </w:p>
+              </w:tc>
+              <w:tc>
+                <w:tcPr/>
+                <w:p>
+                  <w:pPr>
+                    <w:pStyle w:val="Compact"/>
+                    <w:jc w:val="left"/>
+                    <w:jc w:val="center"/>
+                  </w:pPr>
+                  <w:r>
+                    <w:t xml:space="preserve">15–19</w:t>
+                  </w:r>
+                </w:p>
+              </w:tc>
+              <w:tc>
+                <w:tcPr/>
+                <w:p>
+                  <w:pPr>
+                    <w:pStyle w:val="Compact"/>
+                    <w:jc w:val="left"/>
+                    <w:jc w:val="center"/>
+                  </w:pPr>
+                  <w:r>
+                    <w:t xml:space="preserve">days</w:t>
+                  </w:r>
+                </w:p>
+              </w:tc>
+              <w:tc>
+                <w:tcPr/>
+                <w:p>
+                  <w:pPr>
+                    <w:pStyle w:val="Compact"/>
+                    <w:jc w:val="left"/>
+                    <w:jc w:val="center"/>
+                  </w:pPr>
+                  <w:r>
+                    <w:t xml:space="preserve">15–19</w:t>
+                  </w:r>
+                </w:p>
+              </w:tc>
+              <w:tc>
+                <w:tcPr/>
+                <w:p>
+                  <w:pPr>
+                    <w:pStyle w:val="Compact"/>
+                    <w:jc w:val="left"/>
+                    <w:jc w:val="center"/>
+                  </w:pPr>
+                  <w:r>
+                    <w:t xml:space="preserve">15–19</w:t>
+                  </w:r>
+                </w:p>
+              </w:tc>
+            </w:tr>
+            <w:tr>
+              <w:tc>
+                <w:tcPr/>
+                <w:p>
+                  <w:pPr>
+                    <w:pStyle w:val="Compact"/>
+                    <w:jc w:val="left"/>
+                    <w:jc w:val="center"/>
+                  </w:pPr>
+                  <w:r>
+                    <w:t xml:space="preserve">Acidic variants</w:t>
+                  </w:r>
+                </w:p>
+              </w:tc>
+              <w:tc>
+                <w:tcPr/>
+                <w:p>
+                  <w:pPr>
+                    <w:pStyle w:val="Compact"/>
+                    <w:jc w:val="left"/>
+                    <w:jc w:val="center"/>
+                  </w:pPr>
+                  <w:r>
+                    <w:t xml:space="preserve">Dissolved CO2 (pCO2)</w:t>
+                  </w:r>
+                </w:p>
+              </w:tc>
+              <w:tc>
+                <w:tcPr/>
+                <w:p>
+                  <w:pPr>
+                    <w:pStyle w:val="Compact"/>
+                    <w:jc w:val="left"/>
+                    <w:jc w:val="center"/>
+                  </w:pPr>
+                  <w:r>
+                    <w:t xml:space="preserve">40–160</w:t>
+                  </w:r>
+                </w:p>
+              </w:tc>
+              <w:tc>
+                <w:tcPr/>
+                <w:p>
+                  <w:pPr>
+                    <w:pStyle w:val="Compact"/>
+                    <w:jc w:val="left"/>
+                    <w:jc w:val="center"/>
+                  </w:pPr>
+                  <w:r>
+                    <w:t xml:space="preserve">mmHg</w:t>
+                  </w:r>
+                </w:p>
+              </w:tc>
+              <w:tc>
+                <w:tcPr/>
+                <w:p>
+                  <w:pPr>
+                    <w:pStyle w:val="Compact"/>
+                    <w:jc w:val="left"/>
+                    <w:jc w:val="center"/>
+                  </w:pPr>
+                  <w:r>
+                    <w:t xml:space="preserve">40–160</w:t>
+                  </w:r>
+                </w:p>
+              </w:tc>
+              <w:tc>
+                <w:tcPr/>
+                <w:p>
+                  <w:pPr>
+                    <w:pStyle w:val="Compact"/>
+                    <w:jc w:val="left"/>
+                    <w:jc w:val="center"/>
+                  </w:pPr>
+                  <w:r>
+                    <w:t xml:space="preserve">40–160</w:t>
+                  </w:r>
+                </w:p>
+              </w:tc>
+            </w:tr>
+            <w:tr>
+              <w:tc>
+                <w:tcPr/>
+                <w:p>
+                  <w:pPr>
+                    <w:pStyle w:val="Compact"/>
+                    <w:jc w:val="left"/>
+                    <w:jc w:val="center"/>
+                  </w:pPr>
+                  <w:r>
+                    <w:t xml:space="preserve">Aggregates (HMW)</w:t>
+                  </w:r>
+                </w:p>
+              </w:tc>
+              <w:tc>
+                <w:tcPr/>
+                <w:p>
+                  <w:pPr>
+                    <w:pStyle w:val="Compact"/>
+                    <w:jc w:val="left"/>
+                    <w:jc w:val="center"/>
+                  </w:pPr>
+                  <w:r>
+                    <w:t xml:space="preserve">Culture pH</w:t>
+                  </w:r>
+                </w:p>
+              </w:tc>
+              <w:tc>
+                <w:tcPr/>
+                <w:p>
+                  <w:pPr>
+                    <w:pStyle w:val="Compact"/>
+                    <w:jc w:val="left"/>
+                    <w:jc w:val="center"/>
+                  </w:pPr>
+                  <w:r>
+                    <w:t xml:space="preserve">6.6–7.1</w:t>
+                  </w:r>
+                </w:p>
+              </w:tc>
+              <w:tc>
+                <w:tcPr/>
+                <w:p>
+                  <w:pPr>
+                    <w:pStyle w:val="Compact"/>
+                    <w:jc w:val="left"/>
+                    <w:jc w:val="center"/>
+                  </w:pPr>
+                  <w:r>
+                    <w:t xml:space="preserve">pH</w:t>
+                  </w:r>
+                </w:p>
+              </w:tc>
+              <w:tc>
+                <w:tcPr/>
+                <w:p>
+                  <w:pPr>
+                    <w:pStyle w:val="Compact"/>
+                    <w:jc w:val="left"/>
+                    <w:jc w:val="center"/>
+                  </w:pPr>
+                  <w:r>
+                    <w:t xml:space="preserve">6.6–7.1</w:t>
+                  </w:r>
+                </w:p>
+              </w:tc>
+              <w:tc>
+                <w:tcPr/>
+                <w:p>
+                  <w:pPr>
+                    <w:pStyle w:val="Compact"/>
+                    <w:jc w:val="left"/>
+                    <w:jc w:val="center"/>
+                  </w:pPr>
+                  <w:r>
+                    <w:t xml:space="preserve">6.6–7.1</w:t>
+                  </w:r>
+                </w:p>
+              </w:tc>
+            </w:tr>
+            <w:tr>
+              <w:tc>
+                <w:tcPr/>
+                <w:p>
+                  <w:pPr>
+                    <w:pStyle w:val="Compact"/>
+                    <w:jc w:val="left"/>
+                    <w:jc w:val="center"/>
+                  </w:pPr>
+                  <w:r>
+                    <w:t xml:space="preserve">Aggregates (HMW)</w:t>
+                  </w:r>
+                </w:p>
+              </w:tc>
+              <w:tc>
+                <w:tcPr/>
+                <w:p>
+                  <w:pPr>
+                    <w:pStyle w:val="Compact"/>
+                    <w:jc w:val="left"/>
+                    <w:jc w:val="center"/>
+                  </w:pPr>
+                  <w:r>
+                    <w:t xml:space="preserve">Culture temperature</w:t>
+                  </w:r>
+                </w:p>
+              </w:tc>
+              <w:tc>
+                <w:tcPr/>
+                <w:p>
+                  <w:pPr>
+                    <w:pStyle w:val="Compact"/>
+                    <w:jc w:val="left"/>
+                    <w:jc w:val="center"/>
+                  </w:pPr>
+                  <w:r>
+                    <w:t xml:space="preserve">34–36</w:t>
+                  </w:r>
+                </w:p>
+              </w:tc>
+              <w:tc>
+                <w:tcPr/>
+                <w:p>
+                  <w:pPr>
+                    <w:pStyle w:val="Compact"/>
+                    <w:jc w:val="left"/>
+                    <w:jc w:val="center"/>
+                  </w:pPr>
+                  <w:r>
+                    <w:t xml:space="preserve">°C</w:t>
+                  </w:r>
+                </w:p>
+              </w:tc>
+              <w:tc>
+                <w:tcPr/>
+                <w:p>
+                  <w:pPr>
+                    <w:pStyle w:val="Compact"/>
+                    <w:jc w:val="left"/>
+                    <w:jc w:val="center"/>
+                  </w:pPr>
+                  <w:r>
+                    <w:t xml:space="preserve">34–36</w:t>
+                  </w:r>
+                </w:p>
+              </w:tc>
+              <w:tc>
+                <w:tcPr/>
+                <w:p>
+                  <w:pPr>
+                    <w:pStyle w:val="Compact"/>
+                    <w:jc w:val="left"/>
+                    <w:jc w:val="center"/>
+                  </w:pPr>
+                  <w:r>
+                    <w:t xml:space="preserve">34–36</w:t>
+                  </w:r>
+                </w:p>
+              </w:tc>
+            </w:tr>
+            <w:tr>
+              <w:tc>
+                <w:tcPr/>
+                <w:p>
+                  <w:pPr>
+                    <w:pStyle w:val="Compact"/>
+                    <w:jc w:val="left"/>
+                    <w:jc w:val="center"/>
+                  </w:pPr>
+                  <w:r>
+                    <w:t xml:space="preserve">Aggregates (HMW)</w:t>
+                  </w:r>
+                </w:p>
+              </w:tc>
+              <w:tc>
+                <w:tcPr/>
+                <w:p>
+                  <w:pPr>
+                    <w:pStyle w:val="Compact"/>
+                    <w:jc w:val="left"/>
+                    <w:jc w:val="center"/>
+                  </w:pPr>
+                  <w:r>
+                    <w:t xml:space="preserve">Culture duration</w:t>
+                  </w:r>
+                </w:p>
+              </w:tc>
+              <w:tc>
+                <w:tcPr/>
+                <w:p>
+                  <w:pPr>
+                    <w:pStyle w:val="Compact"/>
+                    <w:jc w:val="left"/>
+                    <w:jc w:val="center"/>
+                  </w:pPr>
+                  <w:r>
+                    <w:t xml:space="preserve">15–19</w:t>
+                  </w:r>
+                </w:p>
+              </w:tc>
+              <w:tc>
+                <w:tcPr/>
+                <w:p>
+                  <w:pPr>
+                    <w:pStyle w:val="Compact"/>
+                    <w:jc w:val="left"/>
+                    <w:jc w:val="center"/>
+                  </w:pPr>
+                  <w:r>
+                    <w:t xml:space="preserve">days</w:t>
+                  </w:r>
+                </w:p>
+              </w:tc>
+              <w:tc>
+                <w:tcPr/>
+                <w:p>
+                  <w:pPr>
+                    <w:pStyle w:val="Compact"/>
+                    <w:jc w:val="left"/>
+                    <w:jc w:val="center"/>
+                  </w:pPr>
+                  <w:r>
+                    <w:t xml:space="preserve">15–19</w:t>
+                  </w:r>
+                </w:p>
+              </w:tc>
+              <w:tc>
+                <w:tcPr/>
+                <w:p>
+                  <w:pPr>
+                    <w:pStyle w:val="Compact"/>
+                    <w:jc w:val="left"/>
+                    <w:jc w:val="center"/>
+                  </w:pPr>
+                  <w:r>
+                    <w:t xml:space="preserve">15–19</w:t>
+                  </w:r>
+                </w:p>
+              </w:tc>
+            </w:tr>
+            <w:tr>
+              <w:tc>
+                <w:tcPr/>
+                <w:p>
+                  <w:pPr>
+                    <w:pStyle w:val="Compact"/>
+                    <w:jc w:val="left"/>
+                    <w:jc w:val="center"/>
+                  </w:pPr>
+                  <w:r>
+                    <w:t xml:space="preserve">Aggregates (HMW)</w:t>
+                  </w:r>
+                </w:p>
+              </w:tc>
+              <w:tc>
+                <w:tcPr/>
+                <w:p>
+                  <w:pPr>
+                    <w:pStyle w:val="Compact"/>
+                    <w:jc w:val="left"/>
+                    <w:jc w:val="center"/>
+                  </w:pPr>
+                  <w:r>
+                    <w:t xml:space="preserve">Dissolved CO2 (pCO2)</w:t>
+                  </w:r>
+                </w:p>
+              </w:tc>
+              <w:tc>
+                <w:tcPr/>
+                <w:p>
+                  <w:pPr>
+                    <w:pStyle w:val="Compact"/>
+                    <w:jc w:val="left"/>
+                    <w:jc w:val="center"/>
+                  </w:pPr>
+                  <w:r>
+                    <w:t xml:space="preserve">40–160</w:t>
+                  </w:r>
+                </w:p>
+              </w:tc>
+              <w:tc>
+                <w:tcPr/>
+                <w:p>
+                  <w:pPr>
+                    <w:pStyle w:val="Compact"/>
+                    <w:jc w:val="left"/>
+                    <w:jc w:val="center"/>
+                  </w:pPr>
+                  <w:r>
+                    <w:t xml:space="preserve">mmHg</w:t>
+                  </w:r>
+                </w:p>
+              </w:tc>
+              <w:tc>
+                <w:tcPr/>
+                <w:p>
+                  <w:pPr>
+                    <w:pStyle w:val="Compact"/>
+                    <w:jc w:val="left"/>
+                    <w:jc w:val="center"/>
+                  </w:pPr>
+                  <w:r>
+                    <w:t xml:space="preserve">40–160</w:t>
+                  </w:r>
+                </w:p>
+              </w:tc>
+              <w:tc>
+                <w:tcPr/>
+                <w:p>
+                  <w:pPr>
+                    <w:pStyle w:val="Compact"/>
+                    <w:jc w:val="left"/>
+                    <w:jc w:val="center"/>
+                  </w:pPr>
+                  <w:r>
+                    <w:t xml:space="preserve">40–160</w:t>
+                  </w:r>
+                </w:p>
+              </w:tc>
+            </w:tr>
+          </w:tbl>
+          <w:bookmarkEnd w:id="70"/>
+          <w:p/>
+        </w:tc>
+      </w:tr>
+    </w:tbl>
+    <w:p>
+      <w:pPr>
+        <w:pStyle w:val="BodyText"/>
+      </w:pPr>
+      <w:r>
+        <w:t xml:space="preserve">Across all 20 CQA-by-parameter combinations both ranges coincide with the full</w:t>
+      </w:r>
+      <w:r>
+        <w:t xml:space="preserve"> </w:t>
+      </w:r>
+      <w:r>
+        <w:t xml:space="preserve">characterization range (20 of 20 rows), which is the</w:t>
+      </w:r>
+      <w:r>
+        <w:t xml:space="preserve"> </w:t>
+      </w:r>
+      <w:r>
+        <w:t xml:space="preserve">quantitative statement of univariate robustness: no single parameter, moved anywhere within its</w:t>
+      </w:r>
+      <w:r>
+        <w:t xml:space="preserve"> </w:t>
+      </w:r>
+      <w:r>
+        <w:t xml:space="preserve">studied span, drives any of the 5 governed CQAs to its limit. That the</w:t>
+      </w:r>
+      <w:r>
+        <w:t xml:space="preserve"> </w:t>
+      </w:r>
+      <w:r>
+        <w:t xml:space="preserve">NOR-propagated column reproduces the at-set-point column row for row is the stronger half of the</w:t>
+      </w:r>
+      <w:r>
+        <w:t xml:space="preserve"> </w:t>
+      </w:r>
+      <w:r>
+        <w:t xml:space="preserve">claim — the latitude survives the remaining parameters co-varying across their NORs, not merely</w:t>
+      </w:r>
+      <w:r>
+        <w:t xml:space="preserve"> </w:t>
+      </w:r>
+      <w:r>
+        <w:t xml:space="preserve">their being pinned at set-point. Read against the capability result, this is the same robustness</w:t>
+      </w:r>
+      <w:r>
+        <w:t xml:space="preserve"> </w:t>
+      </w:r>
+      <w:r>
+        <w:t xml:space="preserve">seen from another direction: the tightest attribute clears its limit with wide margin (§Process</w:t>
+      </w:r>
+      <w:r>
+        <w:t xml:space="preserve"> </w:t>
+      </w:r>
+      <w:r>
+        <w:t xml:space="preserve">capability and robustness), and here no parameter reaches that limit anywhere in its range.</w:t>
+      </w:r>
+    </w:p>
+    <w:p>
+      <w:pPr>
+        <w:pStyle w:val="BodyText"/>
+      </w:pPr>
+      <w:r>
+        <w:t xml:space="preserve">That every univariate range is fully acceptable is precisely why the operating region is bound</w:t>
+      </w:r>
+      <w:r>
+        <w:t xml:space="preserve"> </w:t>
+      </w:r>
+      <w:r>
+        <w:t xml:space="preserve">multivariately rather than by any single parameter. High mannose — the very-high-criticality</w:t>
+      </w:r>
+      <w:r>
+        <w:t xml:space="preserve"> </w:t>
+      </w:r>
+      <w:r>
+        <w:t xml:space="preserve">attribute with the tightest commercial capability — is governed by Culture pH, yet its PAR</w:t>
+      </w:r>
+      <w:r>
+        <w:t xml:space="preserve"> </w:t>
+      </w:r>
+      <w:r>
+        <w:t xml:space="preserve">against Culture pH still spans the whole characterization range; the attribute approaches</w:t>
+      </w:r>
+      <w:r>
+        <w:t xml:space="preserve"> </w:t>
+      </w:r>
+      <w:r>
+        <w:t xml:space="preserve">its limit only at the joint high-pH, low-temperature corner identified in the design space, not</w:t>
+      </w:r>
+      <w:r>
+        <w:t xml:space="preserve"> </w:t>
+      </w:r>
+      <w:r>
+        <w:t xml:space="preserve">at any edge of a single parameter. Galactosylation behaves the same way: acceptable across the</w:t>
+      </w:r>
+      <w:r>
+        <w:t xml:space="preserve"> </w:t>
+      </w:r>
+      <w:r>
+        <w:t xml:space="preserve">whole of every studied parameter, it is steered toward its window only by the joint movement of</w:t>
+      </w:r>
+      <w:r>
+        <w:t xml:space="preserve"> </w:t>
+      </w:r>
+      <w:r>
+        <w:t xml:space="preserve">its governing factors. The PAR analysis therefore neither widens nor replaces the design space; it</w:t>
+      </w:r>
+      <w:r>
+        <w:t xml:space="preserve"> </w:t>
+      </w:r>
+      <w:r>
+        <w:t xml:space="preserve">demonstrates that the design-space corner, and not a one-dimensional range, is the active</w:t>
+      </w:r>
+      <w:r>
+        <w:t xml:space="preserve"> </w:t>
+      </w:r>
+      <w:r>
+        <w:t xml:space="preserve">constraint on the operating region.</w:t>
+      </w:r>
+    </w:p>
+    <w:p>
+      <w:pPr>
+        <w:pStyle w:val="BodyText"/>
+      </w:pPr>
+      <w:r>
+        <w:t xml:space="preserve">The per-CQA PAR plots make the table graphical: in each, the response over the governing parameter</w:t>
+      </w:r>
+      <w:r>
+        <w:t xml:space="preserve"> </w:t>
+      </w:r>
+      <w:r>
+        <w:t xml:space="preserve">is drawn with its acceptance limit dashed, the acceptable parameter region shaded green, and the</w:t>
+      </w:r>
+      <w:r>
+        <w:t xml:space="preserve"> </w:t>
+      </w:r>
+      <w:r>
+        <w:t xml:space="preserve">set-point and NOR marked, with the left panel holding the other factors at set-point and the right</w:t>
+      </w:r>
+      <w:r>
+        <w:t xml:space="preserve"> </w:t>
+      </w:r>
+      <w:r>
+        <w:t xml:space="preserve">varying them within their NOR by Monte-Carlo. The efficacy-linked afucosylation and galactosylation</w:t>
+      </w:r>
+      <w:r>
+        <w:t xml:space="preserve"> </w:t>
+      </w:r>
+      <w:r>
+        <w:t xml:space="preserve">glycans are both governed by Culture duration and rise gently with it, staying within their</w:t>
+      </w:r>
+      <w:r>
+        <w:t xml:space="preserve"> </w:t>
+      </w:r>
+      <w:r>
+        <w:t xml:space="preserve">windows across the studied range (</w:t>
+      </w:r>
+      <w:hyperlink w:anchor="fig-par-afuc">
+        <w:r>
+          <w:rPr>
+            <w:rStyle w:val="Hyperlink"/>
+          </w:rPr>
+          <w:t xml:space="preserve">Figure 3</w:t>
+        </w:r>
+      </w:hyperlink>
+      <w:r>
+        <w:t xml:space="preserve">,</w:t>
+      </w:r>
+      <w:r>
+        <w:t xml:space="preserve"> </w:t>
+      </w:r>
+      <w:hyperlink w:anchor="fig-par-gal">
+        <w:r>
+          <w:rPr>
+            <w:rStyle w:val="Hyperlink"/>
+          </w:rPr>
+          <w:t xml:space="preserve">Figure 4</w:t>
+        </w:r>
+      </w:hyperlink>
+      <w:r>
+        <w:t xml:space="preserve">).</w:t>
+      </w:r>
+    </w:p>
+    <w:tbl>
+      <w:tblPr>
+        <w:tblStyle w:val="Table"/>
+        <w:tblW w:type="pct" w:w="5000"/>
+        <w:tblLayout w:type="fixed"/>
+        <w:tblLook w:firstRow="0" w:lastRow="0" w:firstColumn="0" w:lastColumn="0" w:noHBand="0" w:noVBand="0" w:val="0000"/>
+      </w:tblPr>
+      <w:tblGrid>
+        <w:gridCol w:w="7920"/>
+      </w:tblGrid>
+      <w:tr>
+        <w:tc>
+          <w:tcPr/>
+          <w:bookmarkStart w:id="80" w:name="fig-par-afuc"/>
+          <w:tbl>
+            <w:tblPr>
+              <w:tblStyle w:val="Table"/>
+              <w:tblW w:type="pct" w:w="5000"/>
+              <w:tblLayout w:type="fixed"/>
+              <w:tblLook w:firstRow="0" w:lastRow="0" w:firstColumn="0" w:lastColumn="0" w:noHBand="0" w:noVBand="0" w:val="0000"/>
+            </w:tblPr>
+            <w:tblGrid>
+              <w:gridCol w:w="7920"/>
+            </w:tblGrid>
+            <w:tr>
+              <w:tc>
+                <w:tcPr/>
+                <w:bookmarkStart w:id="74" w:name="fig-par-afuc-1"/>
+                <w:p>
+                  <w:pPr>
+                    <w:pStyle w:val="Compact"/>
+                    <w:jc w:val="center"/>
+                    <w:jc w:val="center"/>
+                  </w:pPr>
+                  <w:r>
+                    <w:drawing>
+                      <wp:inline>
+                        <wp:extent cx="5334000" cy="1845992"/>
+                        <wp:effectExtent b="0" l="0" r="0" t="0"/>
+                        <wp:docPr descr="" title="" id="72" name="Picture"/>
+                        <a:graphic>
+                          <a:graphicData uri="http://schemas.openxmlformats.org/drawingml/2006/picture">
+                            <pic:pic>
+                              <pic:nvPicPr>
+                                <pic:cNvPr descr="PCR-003_bioreactor_files/figure-docx/fig-par-afuc-output-1.png" id="73" name="Picture"/>
+                                <pic:cNvPicPr>
+                                  <a:picLocks noChangeArrowheads="1" noChangeAspect="1"/>
+                                </pic:cNvPicPr>
+                              </pic:nvPicPr>
+                              <pic:blipFill>
+                                <a:blip r:embed="rId71"/>
+                                <a:stretch>
+                                  <a:fillRect/>
+                                </a:stretch>
+                              </pic:blipFill>
+                              <pic:spPr bwMode="auto">
+                                <a:xfrm>
+                                  <a:off x="0" y="0"/>
+                                  <a:ext cx="5334000" cy="1845992"/>
+                                </a:xfrm>
+                                <a:prstGeom prst="rect">
+                                  <a:avLst/>
+                                </a:prstGeom>
+                                <a:noFill/>
+                                <a:ln w="9525">
+                                  <a:noFill/>
+                                  <a:headEnd/>
+                                  <a:tailEnd/>
+                                </a:ln>
+                              </pic:spPr>
+                            </pic:pic>
+                          </a:graphicData>
+                        </a:graphic>
+                      </wp:inline>
+                    </w:drawing>
+                  </w:r>
+                </w:p>
+                <w:p>
+                  <w:pPr>
+                    <w:jc w:val="center"/>
+                    <w:jc w:val="center"/>
+                  </w:pPr>
+                  <w:pPr>
+                    <w:jc w:val="left"/>
+                    <w:spacing w:before="200"/>
+                    <w:pStyle w:val="ImageCaption"/>
+                  </w:pPr>
+                  <w:r>
+                    <w:t xml:space="preserve">(a) Proven acceptable range for afucosylation versus its governing parameter, at set-point (left) and with the other factors varying within their NOR (right); the acceptance limits are dashed, the acceptable region is shaded green, and the set-point and NOR are marked.</w:t>
+                  </w:r>
+                </w:p>
+                <w:bookmarkEnd w:id="74"/>
+              </w:tc>
+            </w:tr>
+          </w:tbl>
+          <w:tbl>
+            <w:tblPr>
+              <w:tblStyle w:val="Table"/>
+              <w:tblW w:type="pct" w:w="5000"/>
+              <w:tblLayout w:type="fixed"/>
+              <w:tblLook w:firstRow="0" w:lastRow="0" w:firstColumn="0" w:lastColumn="0" w:noHBand="0" w:noVBand="0" w:val="0000"/>
+            </w:tblPr>
+            <w:tblGrid>
+              <w:gridCol w:w="7920"/>
+            </w:tblGrid>
+            <w:tr>
+              <w:tc>
+                <w:tcPr/>
+                <w:bookmarkStart w:id="79" w:name="fig-par-afuc-2"/>
+                <w:p>
+                  <w:pPr>
+                    <w:pStyle w:val="Compact"/>
+                    <w:jc w:val="center"/>
+                    <w:jc w:val="center"/>
+                  </w:pPr>
+                  <w:bookmarkStart w:id="78" w:name="fig-par-afuc-2"/>
+                  <w:r>
+                    <w:drawing>
+                      <wp:inline>
+                        <wp:extent cx="5334000" cy="1845992"/>
+                        <wp:effectExtent b="0" l="0" r="0" t="0"/>
+                        <wp:docPr descr="" title="" id="76" name="Picture"/>
+                        <a:graphic>
+                          <a:graphicData uri="http://schemas.openxmlformats.org/drawingml/2006/picture">
+                            <pic:pic>
+                              <pic:nvPicPr>
+                                <pic:cNvPr descr="PCR-003_bioreactor_files/figure-docx/fig-par-afuc-output-2.png" id="77" name="Picture"/>
+                                <pic:cNvPicPr>
+                                  <a:picLocks noChangeArrowheads="1" noChangeAspect="1"/>
+                                </pic:cNvPicPr>
+                              </pic:nvPicPr>
+                              <pic:blipFill>
+                                <a:blip r:embed="rId75"/>
+                                <a:stretch>
+                                  <a:fillRect/>
+                                </a:stretch>
+                              </pic:blipFill>
+                              <pic:spPr bwMode="auto">
+                                <a:xfrm>
+                                  <a:off x="0" y="0"/>
+                                  <a:ext cx="5334000" cy="1845992"/>
+                                </a:xfrm>
+                                <a:prstGeom prst="rect">
+                                  <a:avLst/>
+                                </a:prstGeom>
+                                <a:noFill/>
+                                <a:ln w="9525">
+                                  <a:noFill/>
+                                  <a:headEnd/>
+                                  <a:tailEnd/>
+                                </a:ln>
+                              </pic:spPr>
+                            </pic:pic>
+                          </a:graphicData>
+                        </a:graphic>
+                      </wp:inline>
+                    </w:drawing>
+                  </w:r>
+                  <w:bookmarkEnd w:id="78"/>
+                </w:p>
+                <w:p>
+                  <w:pPr>
+                    <w:jc w:val="center"/>
+                    <w:jc w:val="center"/>
+                  </w:pPr>
+                  <w:pPr>
+                    <w:jc w:val="left"/>
+                    <w:spacing w:before="200"/>
+                    <w:pStyle w:val="ImageCaption"/>
+                  </w:pPr>
+                  <w:r>
+                    <w:t xml:space="preserve">(b)</w:t>
+                  </w:r>
+                </w:p>
+                <w:bookmarkEnd w:id="79"/>
+              </w:tc>
+            </w:tr>
+          </w:tbl>
+          <w:p>
+            <w:pPr>
+              <w:jc w:val="center"/>
+            </w:pPr>
+            <w:pPr>
+              <w:jc w:val="left"/>
+              <w:spacing w:before="200"/>
+              <w:pStyle w:val="ImageCaption"/>
+            </w:pPr>
+            <w:r>
+              <w:t xml:space="preserve">Figure 3</w:t>
+            </w:r>
+          </w:p>
+          <w:bookmarkEnd w:id="80"/>
+        </w:tc>
+      </w:tr>
+    </w:tbl>
+    <w:tbl>
+      <w:tblPr>
+        <w:tblStyle w:val="Table"/>
+        <w:tblW w:type="pct" w:w="5000"/>
+        <w:tblLayout w:type="fixed"/>
+        <w:tblLook w:firstRow="0" w:lastRow="0" w:firstColumn="0" w:lastColumn="0" w:noHBand="0" w:noVBand="0" w:val="0000"/>
+      </w:tblPr>
+      <w:tblGrid>
+        <w:gridCol w:w="7920"/>
+      </w:tblGrid>
+      <w:tr>
+        <w:tc>
+          <w:tcPr/>
+          <w:bookmarkStart w:id="90" w:name="fig-par-gal"/>
+          <w:tbl>
+            <w:tblPr>
+              <w:tblStyle w:val="Table"/>
+              <w:tblW w:type="pct" w:w="5000"/>
+              <w:tblLayout w:type="fixed"/>
+              <w:tblLook w:firstRow="0" w:lastRow="0" w:firstColumn="0" w:lastColumn="0" w:noHBand="0" w:noVBand="0" w:val="0000"/>
+            </w:tblPr>
+            <w:tblGrid>
+              <w:gridCol w:w="7920"/>
+            </w:tblGrid>
+            <w:tr>
+              <w:tc>
+                <w:tcPr/>
+                <w:bookmarkStart w:id="84" w:name="fig-par-gal-1"/>
+                <w:p>
+                  <w:pPr>
+                    <w:pStyle w:val="Compact"/>
+                    <w:jc w:val="center"/>
+                    <w:jc w:val="center"/>
+                  </w:pPr>
+                  <w:r>
+                    <w:drawing>
+                      <wp:inline>
+                        <wp:extent cx="5334000" cy="1845992"/>
+                        <wp:effectExtent b="0" l="0" r="0" t="0"/>
+                        <wp:docPr descr="" title="" id="82" name="Picture"/>
+                        <a:graphic>
+                          <a:graphicData uri="http://schemas.openxmlformats.org/drawingml/2006/picture">
+                            <pic:pic>
+                              <pic:nvPicPr>
+                                <pic:cNvPr descr="PCR-003_bioreactor_files/figure-docx/fig-par-gal-output-1.png" id="83" name="Picture"/>
+                                <pic:cNvPicPr>
+                                  <a:picLocks noChangeArrowheads="1" noChangeAspect="1"/>
+                                </pic:cNvPicPr>
+                              </pic:nvPicPr>
+                              <pic:blipFill>
+                                <a:blip r:embed="rId81"/>
+                                <a:stretch>
+                                  <a:fillRect/>
+                                </a:stretch>
+                              </pic:blipFill>
+                              <pic:spPr bwMode="auto">
+                                <a:xfrm>
+                                  <a:off x="0" y="0"/>
+                                  <a:ext cx="5334000" cy="1845992"/>
+                                </a:xfrm>
+                                <a:prstGeom prst="rect">
+                                  <a:avLst/>
+                                </a:prstGeom>
+                                <a:noFill/>
+                                <a:ln w="9525">
+                                  <a:noFill/>
+                                  <a:headEnd/>
+                                  <a:tailEnd/>
+                                </a:ln>
+                              </pic:spPr>
+                            </pic:pic>
+                          </a:graphicData>
+                        </a:graphic>
+                      </wp:inline>
+                    </w:drawing>
+                  </w:r>
+                </w:p>
+                <w:p>
+                  <w:pPr>
+                    <w:jc w:val="center"/>
+                    <w:jc w:val="center"/>
+                  </w:pPr>
+                  <w:pPr>
+                    <w:jc w:val="left"/>
+                    <w:spacing w:before="200"/>
+                    <w:pStyle w:val="ImageCaption"/>
+                  </w:pPr>
+                  <w:r>
+                    <w:t xml:space="preserve">(a) Proven acceptable range for galactosylation versus its governing parameter, at set-point (left) and NOR-propagated (right); acceptance window dashed, acceptable region shaded green, set-point and NOR marked.</w:t>
+                  </w:r>
+                </w:p>
+                <w:bookmarkEnd w:id="84"/>
+              </w:tc>
+            </w:tr>
+          </w:tbl>
+          <w:tbl>
+            <w:tblPr>
+              <w:tblStyle w:val="Table"/>
+              <w:tblW w:type="pct" w:w="5000"/>
+              <w:tblLayout w:type="fixed"/>
+              <w:tblLook w:firstRow="0" w:lastRow="0" w:firstColumn="0" w:lastColumn="0" w:noHBand="0" w:noVBand="0" w:val="0000"/>
+            </w:tblPr>
+            <w:tblGrid>
+              <w:gridCol w:w="7920"/>
+            </w:tblGrid>
+            <w:tr>
+              <w:tc>
+                <w:tcPr/>
+                <w:bookmarkStart w:id="89" w:name="fig-par-gal-2"/>
+                <w:p>
+                  <w:pPr>
+                    <w:pStyle w:val="Compact"/>
+                    <w:jc w:val="center"/>
+                    <w:jc w:val="center"/>
+                  </w:pPr>
+                  <w:bookmarkStart w:id="88" w:name="fig-par-gal-2"/>
+                  <w:r>
+                    <w:drawing>
+                      <wp:inline>
+                        <wp:extent cx="5334000" cy="1845992"/>
+                        <wp:effectExtent b="0" l="0" r="0" t="0"/>
+                        <wp:docPr descr="" title="" id="86" name="Picture"/>
+                        <a:graphic>
+                          <a:graphicData uri="http://schemas.openxmlformats.org/drawingml/2006/picture">
+                            <pic:pic>
+                              <pic:nvPicPr>
+                                <pic:cNvPr descr="PCR-003_bioreactor_files/figure-docx/fig-par-gal-output-2.png" id="87" name="Picture"/>
+                                <pic:cNvPicPr>
+                                  <a:picLocks noChangeArrowheads="1" noChangeAspect="1"/>
+                                </pic:cNvPicPr>
+                              </pic:nvPicPr>
+                              <pic:blipFill>
+                                <a:blip r:embed="rId85"/>
+                                <a:stretch>
+                                  <a:fillRect/>
+                                </a:stretch>
+                              </pic:blipFill>
+                              <pic:spPr bwMode="auto">
+                                <a:xfrm>
+                                  <a:off x="0" y="0"/>
+                                  <a:ext cx="5334000" cy="1845992"/>
+                                </a:xfrm>
+                                <a:prstGeom prst="rect">
+                                  <a:avLst/>
+                                </a:prstGeom>
+                                <a:noFill/>
+                                <a:ln w="9525">
+                                  <a:noFill/>
+                                  <a:headEnd/>
+                                  <a:tailEnd/>
+                                </a:ln>
+                              </pic:spPr>
+                            </pic:pic>
+                          </a:graphicData>
+                        </a:graphic>
+                      </wp:inline>
+                    </w:drawing>
+                  </w:r>
+                  <w:bookmarkEnd w:id="88"/>
+                </w:p>
+                <w:p>
+                  <w:pPr>
+                    <w:jc w:val="center"/>
+                    <w:jc w:val="center"/>
+                  </w:pPr>
+                  <w:pPr>
+                    <w:jc w:val="left"/>
+                    <w:spacing w:before="200"/>
+                    <w:pStyle w:val="ImageCaption"/>
+                  </w:pPr>
+                  <w:r>
+                    <w:t xml:space="preserve">(b)</w:t>
+                  </w:r>
+                </w:p>
+                <w:bookmarkEnd w:id="89"/>
+              </w:tc>
+            </w:tr>
+          </w:tbl>
+          <w:p>
+            <w:pPr>
+              <w:jc w:val="center"/>
+            </w:pPr>
+            <w:pPr>
+              <w:jc w:val="left"/>
+              <w:spacing w:before="200"/>
+              <w:pStyle w:val="ImageCaption"/>
+            </w:pPr>
+            <w:r>
+              <w:t xml:space="preserve">Figure 4</w:t>
+            </w:r>
+          </w:p>
+          <w:bookmarkEnd w:id="90"/>
+        </w:tc>
+      </w:tr>
+    </w:tbl>
+    <w:p>
+      <w:pPr>
+        <w:pStyle w:val="BodyText"/>
+      </w:pPr>
+      <w:r>
+        <w:t xml:space="preserve">High mannose, the binding glycan, is governed by Culture pH, which raises it; across the</w:t>
+      </w:r>
+      <w:r>
+        <w:t xml:space="preserve"> </w:t>
+      </w:r>
+      <w:r>
+        <w:t xml:space="preserve">whole characterization range of that parameter the response stays inside its two-sided window, and</w:t>
+      </w:r>
+      <w:r>
+        <w:t xml:space="preserve"> </w:t>
+      </w:r>
+      <w:r>
+        <w:t xml:space="preserve">the NOR-propagated predictive band stays within acceptance (</w:t>
+      </w:r>
+      <w:hyperlink w:anchor="fig-par-hm">
+        <w:r>
+          <w:rPr>
+            <w:rStyle w:val="Hyperlink"/>
+          </w:rPr>
+          <w:t xml:space="preserve">Figure 5</w:t>
+        </w:r>
+      </w:hyperlink>
+      <w:r>
+        <w:t xml:space="preserve">).</w:t>
+      </w:r>
+    </w:p>
+    <w:tbl>
+      <w:tblPr>
+        <w:tblStyle w:val="Table"/>
+        <w:tblW w:type="pct" w:w="5000"/>
+        <w:tblLayout w:type="fixed"/>
+        <w:tblLook w:firstRow="0" w:lastRow="0" w:firstColumn="0" w:lastColumn="0" w:noHBand="0" w:noVBand="0" w:val="0000"/>
+      </w:tblPr>
+      <w:tblGrid>
+        <w:gridCol w:w="7920"/>
+      </w:tblGrid>
+      <w:tr>
+        <w:tc>
+          <w:tcPr/>
+          <w:bookmarkStart w:id="100" w:name="fig-par-hm"/>
+          <w:tbl>
+            <w:tblPr>
+              <w:tblStyle w:val="Table"/>
+              <w:tblW w:type="pct" w:w="5000"/>
+              <w:tblLayout w:type="fixed"/>
+              <w:tblLook w:firstRow="0" w:lastRow="0" w:firstColumn="0" w:lastColumn="0" w:noHBand="0" w:noVBand="0" w:val="0000"/>
+            </w:tblPr>
+            <w:tblGrid>
+              <w:gridCol w:w="7920"/>
+            </w:tblGrid>
+            <w:tr>
+              <w:tc>
+                <w:tcPr/>
+                <w:bookmarkStart w:id="94" w:name="fig-par-hm-1"/>
+                <w:p>
+                  <w:pPr>
+                    <w:pStyle w:val="Compact"/>
+                    <w:jc w:val="center"/>
+                    <w:jc w:val="center"/>
+                  </w:pPr>
+                  <w:r>
+                    <w:drawing>
+                      <wp:inline>
+                        <wp:extent cx="5334000" cy="1845992"/>
+                        <wp:effectExtent b="0" l="0" r="0" t="0"/>
+                        <wp:docPr descr="" title="" id="92" name="Picture"/>
+                        <a:graphic>
+                          <a:graphicData uri="http://schemas.openxmlformats.org/drawingml/2006/picture">
+                            <pic:pic>
+                              <pic:nvPicPr>
+                                <pic:cNvPr descr="PCR-003_bioreactor_files/figure-docx/fig-par-hm-output-1.png" id="93" name="Picture"/>
+                                <pic:cNvPicPr>
+                                  <a:picLocks noChangeArrowheads="1" noChangeAspect="1"/>
+                                </pic:cNvPicPr>
+                              </pic:nvPicPr>
+                              <pic:blipFill>
+                                <a:blip r:embed="rId91"/>
+                                <a:stretch>
+                                  <a:fillRect/>
+                                </a:stretch>
+                              </pic:blipFill>
+                              <pic:spPr bwMode="auto">
+                                <a:xfrm>
+                                  <a:off x="0" y="0"/>
+                                  <a:ext cx="5334000" cy="1845992"/>
+                                </a:xfrm>
+                                <a:prstGeom prst="rect">
+                                  <a:avLst/>
+                                </a:prstGeom>
+                                <a:noFill/>
+                                <a:ln w="9525">
+                                  <a:noFill/>
+                                  <a:headEnd/>
+                                  <a:tailEnd/>
+                                </a:ln>
+                              </pic:spPr>
+                            </pic:pic>
+                          </a:graphicData>
+                        </a:graphic>
+                      </wp:inline>
+                    </w:drawing>
+                  </w:r>
+                </w:p>
+                <w:p>
+                  <w:pPr>
+                    <w:jc w:val="center"/>
+                    <w:jc w:val="center"/>
+                  </w:pPr>
+                  <w:pPr>
+                    <w:jc w:val="left"/>
+                    <w:spacing w:before="200"/>
+                    <w:pStyle w:val="ImageCaption"/>
+                  </w:pPr>
+                  <w:r>
+                    <w:t xml:space="preserve">(a) Proven acceptable range for high mannose versus its governing parameter, at set-point (left) and NOR-propagated (right); the two-sided acceptance window is dashed, the acceptable region is shaded green, and the set-point and NOR are marked.</w:t>
+                  </w:r>
+                </w:p>
+                <w:bookmarkEnd w:id="94"/>
+              </w:tc>
+            </w:tr>
+          </w:tbl>
+          <w:tbl>
+            <w:tblPr>
+              <w:tblStyle w:val="Table"/>
+              <w:tblW w:type="pct" w:w="5000"/>
+              <w:tblLayout w:type="fixed"/>
+              <w:tblLook w:firstRow="0" w:lastRow="0" w:firstColumn="0" w:lastColumn="0" w:noHBand="0" w:noVBand="0" w:val="0000"/>
+            </w:tblPr>
+            <w:tblGrid>
+              <w:gridCol w:w="7920"/>
+            </w:tblGrid>
+            <w:tr>
+              <w:tc>
+                <w:tcPr/>
+                <w:bookmarkStart w:id="99" w:name="fig-par-hm-2"/>
+                <w:p>
+                  <w:pPr>
+                    <w:pStyle w:val="Compact"/>
+                    <w:jc w:val="center"/>
+                    <w:jc w:val="center"/>
+                  </w:pPr>
+                  <w:bookmarkStart w:id="98" w:name="fig-par-hm-2"/>
+                  <w:r>
+                    <w:drawing>
+                      <wp:inline>
+                        <wp:extent cx="5334000" cy="1845992"/>
+                        <wp:effectExtent b="0" l="0" r="0" t="0"/>
+                        <wp:docPr descr="" title="" id="96" name="Picture"/>
+                        <a:graphic>
+                          <a:graphicData uri="http://schemas.openxmlformats.org/drawingml/2006/picture">
+                            <pic:pic>
+                              <pic:nvPicPr>
+                                <pic:cNvPr descr="PCR-003_bioreactor_files/figure-docx/fig-par-hm-output-2.png" id="97" name="Picture"/>
+                                <pic:cNvPicPr>
+                                  <a:picLocks noChangeArrowheads="1" noChangeAspect="1"/>
+                                </pic:cNvPicPr>
+                              </pic:nvPicPr>
+                              <pic:blipFill>
+                                <a:blip r:embed="rId95"/>
+                                <a:stretch>
+                                  <a:fillRect/>
+                                </a:stretch>
+                              </pic:blipFill>
+                              <pic:spPr bwMode="auto">
+                                <a:xfrm>
+                                  <a:off x="0" y="0"/>
+                                  <a:ext cx="5334000" cy="1845992"/>
+                                </a:xfrm>
+                                <a:prstGeom prst="rect">
+                                  <a:avLst/>
+                                </a:prstGeom>
+                                <a:noFill/>
+                                <a:ln w="9525">
+                                  <a:noFill/>
+                                  <a:headEnd/>
+                                  <a:tailEnd/>
+                                </a:ln>
+                              </pic:spPr>
+                            </pic:pic>
+                          </a:graphicData>
+                        </a:graphic>
+                      </wp:inline>
+                    </w:drawing>
+                  </w:r>
+                  <w:bookmarkEnd w:id="98"/>
+                </w:p>
+                <w:p>
+                  <w:pPr>
+                    <w:jc w:val="center"/>
+                    <w:jc w:val="center"/>
+                  </w:pPr>
+                  <w:pPr>
+                    <w:jc w:val="left"/>
+                    <w:spacing w:before="200"/>
+                    <w:pStyle w:val="ImageCaption"/>
+                  </w:pPr>
+                  <w:r>
+                    <w:t xml:space="preserve">(b)</w:t>
+                  </w:r>
+                </w:p>
+                <w:bookmarkEnd w:id="99"/>
+              </w:tc>
+            </w:tr>
+          </w:tbl>
+          <w:p>
+            <w:pPr>
+              <w:jc w:val="center"/>
+            </w:pPr>
+            <w:pPr>
+              <w:jc w:val="left"/>
+              <w:spacing w:before="200"/>
+              <w:pStyle w:val="ImageCaption"/>
+            </w:pPr>
+            <w:r>
+              <w:t xml:space="preserve">Figure 5</w:t>
+            </w:r>
+          </w:p>
+          <w:bookmarkEnd w:id="100"/>
+        </w:tc>
+      </w:tr>
+    </w:tbl>
+    <w:p>
+      <w:pPr>
+        <w:pStyle w:val="BodyText"/>
+      </w:pPr>
+      <w:r>
+        <w:t xml:space="preserve">The acidic charge variants are governed by Dissolved CO2 (pCO2) — their dominant driver — and stay</w:t>
+      </w:r>
+      <w:r>
+        <w:t xml:space="preserve"> </w:t>
+      </w:r>
+      <w:r>
+        <w:t xml:space="preserve">below the upper acceptance limit across the full range of that parameter, consistent with the</w:t>
+      </w:r>
+      <w:r>
+        <w:t xml:space="preserve"> </w:t>
+      </w:r>
+      <w:r>
+        <w:t xml:space="preserve">attribute’s wide, clinically qualified window (</w:t>
+      </w:r>
+      <w:hyperlink w:anchor="fig-par-av">
+        <w:r>
+          <w:rPr>
+            <w:rStyle w:val="Hyperlink"/>
+          </w:rPr>
+          <w:t xml:space="preserve">Figure 6</w:t>
+        </w:r>
+      </w:hyperlink>
+      <w:r>
+        <w:t xml:space="preserve">). The aggregate content, governed by</w:t>
+      </w:r>
+      <w:r>
+        <w:t xml:space="preserve"> </w:t>
+      </w:r>
+      <w:r>
+        <w:t xml:space="preserve">Culture pH, likewise stays below its upper limit across the range (</w:t>
+      </w:r>
+      <w:hyperlink w:anchor="fig-par-agg">
+        <w:r>
+          <w:rPr>
+            <w:rStyle w:val="Hyperlink"/>
+          </w:rPr>
+          <w:t xml:space="preserve">Figure 7</w:t>
+        </w:r>
+      </w:hyperlink>
+      <w:r>
+        <w:t xml:space="preserve">).</w:t>
+      </w:r>
+    </w:p>
+    <w:tbl>
+      <w:tblPr>
+        <w:tblStyle w:val="Table"/>
+        <w:tblW w:type="pct" w:w="5000"/>
+        <w:tblLayout w:type="fixed"/>
+        <w:tblLook w:firstRow="0" w:lastRow="0" w:firstColumn="0" w:lastColumn="0" w:noHBand="0" w:noVBand="0" w:val="0000"/>
+      </w:tblPr>
+      <w:tblGrid>
+        <w:gridCol w:w="7920"/>
+      </w:tblGrid>
+      <w:tr>
+        <w:tc>
+          <w:tcPr/>
+          <w:bookmarkStart w:id="110" w:name="fig-par-av"/>
+          <w:tbl>
+            <w:tblPr>
+              <w:tblStyle w:val="Table"/>
+              <w:tblW w:type="pct" w:w="5000"/>
+              <w:tblLayout w:type="fixed"/>
+              <w:tblLook w:firstRow="0" w:lastRow="0" w:firstColumn="0" w:lastColumn="0" w:noHBand="0" w:noVBand="0" w:val="0000"/>
+            </w:tblPr>
+            <w:tblGrid>
+              <w:gridCol w:w="7920"/>
+            </w:tblGrid>
+            <w:tr>
+              <w:tc>
+                <w:tcPr/>
+                <w:bookmarkStart w:id="104" w:name="fig-par-av-1"/>
+                <w:p>
+                  <w:pPr>
+                    <w:pStyle w:val="Compact"/>
+                    <w:jc w:val="center"/>
+                    <w:jc w:val="center"/>
+                  </w:pPr>
+                  <w:r>
+                    <w:drawing>
+                      <wp:inline>
+                        <wp:extent cx="5334000" cy="1845992"/>
+                        <wp:effectExtent b="0" l="0" r="0" t="0"/>
+                        <wp:docPr descr="" title="" id="102" name="Picture"/>
+                        <a:graphic>
+                          <a:graphicData uri="http://schemas.openxmlformats.org/drawingml/2006/picture">
+                            <pic:pic>
+                              <pic:nvPicPr>
+                                <pic:cNvPr descr="PCR-003_bioreactor_files/figure-docx/fig-par-av-output-1.png" id="103" name="Picture"/>
+                                <pic:cNvPicPr>
+                                  <a:picLocks noChangeArrowheads="1" noChangeAspect="1"/>
+                                </pic:cNvPicPr>
+                              </pic:nvPicPr>
+                              <pic:blipFill>
+                                <a:blip r:embed="rId101"/>
+                                <a:stretch>
+                                  <a:fillRect/>
+                                </a:stretch>
+                              </pic:blipFill>
+                              <pic:spPr bwMode="auto">
+                                <a:xfrm>
+                                  <a:off x="0" y="0"/>
+                                  <a:ext cx="5334000" cy="1845992"/>
+                                </a:xfrm>
+                                <a:prstGeom prst="rect">
+                                  <a:avLst/>
+                                </a:prstGeom>
+                                <a:noFill/>
+                                <a:ln w="9525">
+                                  <a:noFill/>
+                                  <a:headEnd/>
+                                  <a:tailEnd/>
+                                </a:ln>
+                              </pic:spPr>
+                            </pic:pic>
+                          </a:graphicData>
+                        </a:graphic>
+                      </wp:inline>
+                    </w:drawing>
+                  </w:r>
+                </w:p>
+                <w:p>
+                  <w:pPr>
+                    <w:jc w:val="center"/>
+                    <w:jc w:val="center"/>
+                  </w:pPr>
+                  <w:pPr>
+                    <w:jc w:val="left"/>
+                    <w:spacing w:before="200"/>
+                    <w:pStyle w:val="ImageCaption"/>
+                  </w:pPr>
+                  <w:r>
+                    <w:t xml:space="preserve">(a) Proven acceptable range for the acidic charge variants versus their governing parameter, at set-point (left) and NOR-propagated (right); acceptance limit dashed, acceptable region shaded green, set-point and NOR marked.</w:t>
+                  </w:r>
+                </w:p>
+                <w:bookmarkEnd w:id="104"/>
+              </w:tc>
+            </w:tr>
+          </w:tbl>
+          <w:tbl>
+            <w:tblPr>
+              <w:tblStyle w:val="Table"/>
+              <w:tblW w:type="pct" w:w="5000"/>
+              <w:tblLayout w:type="fixed"/>
+              <w:tblLook w:firstRow="0" w:lastRow="0" w:firstColumn="0" w:lastColumn="0" w:noHBand="0" w:noVBand="0" w:val="0000"/>
+            </w:tblPr>
+            <w:tblGrid>
+              <w:gridCol w:w="7920"/>
+            </w:tblGrid>
+            <w:tr>
+              <w:tc>
+                <w:tcPr/>
+                <w:bookmarkStart w:id="109" w:name="fig-par-av-2"/>
+                <w:p>
+                  <w:pPr>
+                    <w:pStyle w:val="Compact"/>
+                    <w:jc w:val="center"/>
+                    <w:jc w:val="center"/>
+                  </w:pPr>
+                  <w:bookmarkStart w:id="108" w:name="fig-par-av-2"/>
+                  <w:r>
+                    <w:drawing>
+                      <wp:inline>
+                        <wp:extent cx="5334000" cy="1845992"/>
+                        <wp:effectExtent b="0" l="0" r="0" t="0"/>
+                        <wp:docPr descr="" title="" id="106" name="Picture"/>
+                        <a:graphic>
+                          <a:graphicData uri="http://schemas.openxmlformats.org/drawingml/2006/picture">
+                            <pic:pic>
+                              <pic:nvPicPr>
+                                <pic:cNvPr descr="PCR-003_bioreactor_files/figure-docx/fig-par-av-output-2.png" id="107" name="Picture"/>
+                                <pic:cNvPicPr>
+                                  <a:picLocks noChangeArrowheads="1" noChangeAspect="1"/>
+                                </pic:cNvPicPr>
+                              </pic:nvPicPr>
+                              <pic:blipFill>
+                                <a:blip r:embed="rId105"/>
+                                <a:stretch>
+                                  <a:fillRect/>
+                                </a:stretch>
+                              </pic:blipFill>
+                              <pic:spPr bwMode="auto">
+                                <a:xfrm>
+                                  <a:off x="0" y="0"/>
+                                  <a:ext cx="5334000" cy="1845992"/>
+                                </a:xfrm>
+                                <a:prstGeom prst="rect">
+                                  <a:avLst/>
+                                </a:prstGeom>
+                                <a:noFill/>
+                                <a:ln w="9525">
+                                  <a:noFill/>
+                                  <a:headEnd/>
+                                  <a:tailEnd/>
+                                </a:ln>
+                              </pic:spPr>
+                            </pic:pic>
+                          </a:graphicData>
+                        </a:graphic>
+                      </wp:inline>
+                    </w:drawing>
+                  </w:r>
+                  <w:bookmarkEnd w:id="108"/>
+                </w:p>
+                <w:p>
+                  <w:pPr>
+                    <w:jc w:val="center"/>
+                    <w:jc w:val="center"/>
+                  </w:pPr>
+                  <w:pPr>
+                    <w:jc w:val="left"/>
+                    <w:spacing w:before="200"/>
+                    <w:pStyle w:val="ImageCaption"/>
+                  </w:pPr>
+                  <w:r>
+                    <w:t xml:space="preserve">(b)</w:t>
+                  </w:r>
+                </w:p>
+                <w:bookmarkEnd w:id="109"/>
+              </w:tc>
+            </w:tr>
+          </w:tbl>
+          <w:p>
+            <w:pPr>
+              <w:jc w:val="center"/>
+            </w:pPr>
+            <w:pPr>
+              <w:jc w:val="left"/>
+              <w:spacing w:before="200"/>
+              <w:pStyle w:val="ImageCaption"/>
+            </w:pPr>
+            <w:r>
+              <w:t xml:space="preserve">Figure 6</w:t>
+            </w:r>
+          </w:p>
+          <w:bookmarkEnd w:id="110"/>
+        </w:tc>
+      </w:tr>
+    </w:tbl>
+    <w:tbl>
+      <w:tblPr>
+        <w:tblStyle w:val="Table"/>
+        <w:tblW w:type="pct" w:w="5000"/>
+        <w:tblLayout w:type="fixed"/>
+        <w:tblLook w:firstRow="0" w:lastRow="0" w:firstColumn="0" w:lastColumn="0" w:noHBand="0" w:noVBand="0" w:val="0000"/>
+      </w:tblPr>
+      <w:tblGrid>
+        <w:gridCol w:w="7920"/>
+      </w:tblGrid>
+      <w:tr>
+        <w:tc>
+          <w:tcPr/>
+          <w:bookmarkStart w:id="120" w:name="fig-par-agg"/>
+          <w:tbl>
+            <w:tblPr>
+              <w:tblStyle w:val="Table"/>
+              <w:tblW w:type="pct" w:w="5000"/>
+              <w:tblLayout w:type="fixed"/>
+              <w:tblLook w:firstRow="0" w:lastRow="0" w:firstColumn="0" w:lastColumn="0" w:noHBand="0" w:noVBand="0" w:val="0000"/>
+            </w:tblPr>
+            <w:tblGrid>
+              <w:gridCol w:w="7920"/>
+            </w:tblGrid>
+            <w:tr>
+              <w:tc>
+                <w:tcPr/>
+                <w:bookmarkStart w:id="114" w:name="fig-par-agg-1"/>
+                <w:p>
+                  <w:pPr>
+                    <w:pStyle w:val="Compact"/>
+                    <w:jc w:val="center"/>
+                    <w:jc w:val="center"/>
+                  </w:pPr>
+                  <w:r>
+                    <w:drawing>
+                      <wp:inline>
+                        <wp:extent cx="5334000" cy="1845992"/>
+                        <wp:effectExtent b="0" l="0" r="0" t="0"/>
+                        <wp:docPr descr="" title="" id="112" name="Picture"/>
+                        <a:graphic>
+                          <a:graphicData uri="http://schemas.openxmlformats.org/drawingml/2006/picture">
+                            <pic:pic>
+                              <pic:nvPicPr>
+                                <pic:cNvPr descr="PCR-003_bioreactor_files/figure-docx/fig-par-agg-output-1.png" id="113" name="Picture"/>
+                                <pic:cNvPicPr>
+                                  <a:picLocks noChangeArrowheads="1" noChangeAspect="1"/>
+                                </pic:cNvPicPr>
+                              </pic:nvPicPr>
+                              <pic:blipFill>
+                                <a:blip r:embed="rId111"/>
+                                <a:stretch>
+                                  <a:fillRect/>
+                                </a:stretch>
+                              </pic:blipFill>
+                              <pic:spPr bwMode="auto">
+                                <a:xfrm>
+                                  <a:off x="0" y="0"/>
+                                  <a:ext cx="5334000" cy="1845992"/>
+                                </a:xfrm>
+                                <a:prstGeom prst="rect">
+                                  <a:avLst/>
+                                </a:prstGeom>
+                                <a:noFill/>
+                                <a:ln w="9525">
+                                  <a:noFill/>
+                                  <a:headEnd/>
+                                  <a:tailEnd/>
+                                </a:ln>
+                              </pic:spPr>
+                            </pic:pic>
+                          </a:graphicData>
+                        </a:graphic>
+                      </wp:inline>
+                    </w:drawing>
+                  </w:r>
+                </w:p>
+                <w:p>
+                  <w:pPr>
+                    <w:jc w:val="center"/>
+                    <w:jc w:val="center"/>
+                  </w:pPr>
+                  <w:pPr>
+                    <w:jc w:val="left"/>
+                    <w:spacing w:before="200"/>
+                    <w:pStyle w:val="ImageCaption"/>
+                  </w:pPr>
+                  <w:r>
+                    <w:t xml:space="preserve">(a) Proven acceptable range for aggregates (HMW) versus its governing parameter, at set-point (left) and NOR-propagated (right); acceptance limit dashed, acceptable region shaded green, set-point and NOR marked.</w:t>
+                  </w:r>
+                </w:p>
+                <w:bookmarkEnd w:id="114"/>
+              </w:tc>
+            </w:tr>
+          </w:tbl>
+          <w:tbl>
+            <w:tblPr>
+              <w:tblStyle w:val="Table"/>
+              <w:tblW w:type="pct" w:w="5000"/>
+              <w:tblLayout w:type="fixed"/>
+              <w:tblLook w:firstRow="0" w:lastRow="0" w:firstColumn="0" w:lastColumn="0" w:noHBand="0" w:noVBand="0" w:val="0000"/>
+            </w:tblPr>
+            <w:tblGrid>
+              <w:gridCol w:w="7920"/>
+            </w:tblGrid>
+            <w:tr>
+              <w:tc>
+                <w:tcPr/>
+                <w:bookmarkStart w:id="119" w:name="fig-par-agg-2"/>
+                <w:p>
+                  <w:pPr>
+                    <w:pStyle w:val="Compact"/>
+                    <w:jc w:val="center"/>
+                    <w:jc w:val="center"/>
+                  </w:pPr>
+                  <w:bookmarkStart w:id="118" w:name="fig-par-agg-2"/>
+                  <w:r>
+                    <w:drawing>
+                      <wp:inline>
+                        <wp:extent cx="5334000" cy="1845992"/>
+                        <wp:effectExtent b="0" l="0" r="0" t="0"/>
+                        <wp:docPr descr="" title="" id="116" name="Picture"/>
+                        <a:graphic>
+                          <a:graphicData uri="http://schemas.openxmlformats.org/drawingml/2006/picture">
+                            <pic:pic>
+                              <pic:nvPicPr>
+                                <pic:cNvPr descr="PCR-003_bioreactor_files/figure-docx/fig-par-agg-output-2.png" id="117" name="Picture"/>
+                                <pic:cNvPicPr>
+                                  <a:picLocks noChangeArrowheads="1" noChangeAspect="1"/>
+                                </pic:cNvPicPr>
+                              </pic:nvPicPr>
+                              <pic:blipFill>
+                                <a:blip r:embed="rId115"/>
+                                <a:stretch>
+                                  <a:fillRect/>
+                                </a:stretch>
+                              </pic:blipFill>
+                              <pic:spPr bwMode="auto">
+                                <a:xfrm>
+                                  <a:off x="0" y="0"/>
+                                  <a:ext cx="5334000" cy="1845992"/>
+                                </a:xfrm>
+                                <a:prstGeom prst="rect">
+                                  <a:avLst/>
+                                </a:prstGeom>
+                                <a:noFill/>
+                                <a:ln w="9525">
+                                  <a:noFill/>
+                                  <a:headEnd/>
+                                  <a:tailEnd/>
+                                </a:ln>
+                              </pic:spPr>
+                            </pic:pic>
+                          </a:graphicData>
+                        </a:graphic>
+                      </wp:inline>
+                    </w:drawing>
+                  </w:r>
+                  <w:bookmarkEnd w:id="118"/>
+                </w:p>
+                <w:p>
+                  <w:pPr>
+                    <w:jc w:val="center"/>
+                    <w:jc w:val="center"/>
+                  </w:pPr>
+                  <w:pPr>
+                    <w:jc w:val="left"/>
+                    <w:spacing w:before="200"/>
+                    <w:pStyle w:val="ImageCaption"/>
+                  </w:pPr>
+                  <w:r>
+                    <w:t xml:space="preserve">(b)</w:t>
+                  </w:r>
+                </w:p>
+                <w:bookmarkEnd w:id="119"/>
+              </w:tc>
+            </w:tr>
+          </w:tbl>
+          <w:p>
+            <w:pPr>
+              <w:jc w:val="center"/>
+            </w:pPr>
+            <w:pPr>
+              <w:jc w:val="left"/>
+              <w:spacing w:before="200"/>
+              <w:pStyle w:val="ImageCaption"/>
+            </w:pPr>
+            <w:r>
+              <w:t xml:space="preserve">Figure 7</w:t>
+            </w:r>
+          </w:p>
+          <w:bookmarkEnd w:id="120"/>
+        </w:tc>
+      </w:tr>
+    </w:tbl>
+    <w:p>
+      <w:pPr>
+        <w:pStyle w:val="BodyText"/>
+      </w:pPr>
+      <w:r>
+        <w:t xml:space="preserve">These proven acceptable ranges are bounded in the same way as the design space they refine. They</w:t>
+      </w:r>
+      <w:r>
+        <w:t xml:space="preserve"> </w:t>
+      </w:r>
+      <w:r>
+        <w:t xml:space="preserve">hold over the characterization ranges and are not extrapolated beyond them; a parameter’s PAR is</w:t>
+      </w:r>
+      <w:r>
+        <w:t xml:space="preserve"> </w:t>
+      </w:r>
+      <w:r>
+        <w:t xml:space="preserve">reported as its studied span because the response remained acceptable to that span’s edges, not</w:t>
+      </w:r>
+      <w:r>
+        <w:t xml:space="preserve"> </w:t>
+      </w:r>
+      <w:r>
+        <w:t xml:space="preserve">because acceptability was demonstrated further. They are properties of the fitted response-surface</w:t>
+      </w:r>
+      <w:r>
+        <w:t xml:space="preserve"> </w:t>
+      </w:r>
+      <w:r>
+        <w:t xml:space="preserve">model on the qualified scale-down model, so the NOR-propagated ranges inherit that model’s range</w:t>
+      </w:r>
+      <w:r>
+        <w:t xml:space="preserve"> </w:t>
+      </w:r>
+      <w:r>
+        <w:t xml:space="preserve">of validity, and movement of any parameter beyond its characterization range would be assessed as</w:t>
+      </w:r>
+      <w:r>
+        <w:t xml:space="preserve"> </w:t>
+      </w:r>
+      <w:r>
+        <w:t xml:space="preserve">a change under the quality system</w:t>
+      </w:r>
+      <w:r>
+        <w:t xml:space="preserve"> </w:t>
+      </w:r>
+      <w:r>
+        <w:t xml:space="preserve">(International Council for Harmonisation 2009)</w:t>
+      </w:r>
+      <w:r>
+        <w:t xml:space="preserve">. Within those bounds the conclusion is unqualified:</w:t>
+      </w:r>
+      <w:r>
+        <w:t xml:space="preserve"> </w:t>
+      </w:r>
+      <w:r>
+        <w:t xml:space="preserve">every studied parameter is proven acceptable across its whole characterization range, and the</w:t>
+      </w:r>
+      <w:r>
+        <w:t xml:space="preserve"> </w:t>
+      </w:r>
+      <w:r>
+        <w:t xml:space="preserve">operating region is constrained by the multivariate design-space corner rather than by any</w:t>
+      </w:r>
+      <w:r>
+        <w:t xml:space="preserve"> </w:t>
+      </w:r>
+      <w:r>
+        <w:t xml:space="preserve">univariate range.</w:t>
+      </w:r>
+    </w:p>
+    <w:bookmarkEnd w:id="121"/>
+    <w:bookmarkStart w:id="123" w:name="process-capability-and-robustness"/>
+    <w:p>
+      <w:pPr>
+        <w:pStyle w:val="Heading1"/>
+      </w:pPr>
+      <w:r>
+        <w:t xml:space="preserve">8. Process capability and robustness</w:t>
+      </w:r>
+    </w:p>
+    <w:p>
+      <w:pPr>
+        <w:pStyle w:val="FirstParagraph"/>
+      </w:pPr>
+      <w:r>
+        <w:t xml:space="preserve">Every CQA the step forms is capable at commercial scale, with the tightest margin belonging to</w:t>
+      </w:r>
+      <w:r>
+        <w:t xml:space="preserve"> </w:t>
+      </w:r>
+      <w:r>
+        <w:t xml:space="preserve">high mannose. A Monte-Carlo simulation of 2,000 batches, with</w:t>
+      </w:r>
+      <w:r>
+        <w:t xml:space="preserve"> </w:t>
+      </w:r>
+      <w:r>
+        <w:t xml:space="preserve">the parameters varied across their normal operating ranges, propagated the culture variability</w:t>
+      </w:r>
+      <w:r>
+        <w:t xml:space="preserve"> </w:t>
+      </w:r>
+      <w:r>
+        <w:t xml:space="preserve">into each response; the resulting one-sided capability indices are given in</w:t>
+      </w:r>
+      <w:r>
+        <w:t xml:space="preserve"> </w:t>
+      </w:r>
+      <w:hyperlink w:anchor="tbl-cap">
+        <w:r>
+          <w:rPr>
+            <w:rStyle w:val="Hyperlink"/>
+          </w:rPr>
+          <w:t xml:space="preserve">Table 15</w:t>
+        </w:r>
+      </w:hyperlink>
+      <w:r>
+        <w:t xml:space="preserve">.</w:t>
+      </w:r>
+    </w:p>
+    <w:tbl>
+      <w:tblPr>
+        <w:tblStyle w:val="Table"/>
+        <w:tblW w:type="pct" w:w="5000"/>
+        <w:tblLayout w:type="fixed"/>
+        <w:tblLook w:firstRow="0" w:lastRow="0" w:firstColumn="0" w:lastColumn="0" w:noHBand="0" w:noVBand="0" w:val="0000"/>
+      </w:tblPr>
+      <w:tblGrid>
+        <w:gridCol w:w="7920"/>
+      </w:tblGrid>
+      <w:tr>
+        <w:tc>
+          <w:tcPr/>
+          <w:bookmarkStart w:id="122" w:name="tbl-cap"/>
+          <w:p>
+            <w:pPr>
+              <w:jc w:val="center"/>
+            </w:pPr>
+            <w:pPr>
+              <w:jc w:val="left"/>
+              <w:spacing w:before="200"/>
+              <w:pStyle w:val="ImageCaption"/>
+            </w:pPr>
+            <w:r>
+              <w:t xml:space="preserve">Table 15: Commercial-scale process capability for the CQAs formed at the production bioreactor, from the normal-operating-range Monte-Carlo simulation.</w:t>
             </w:r>
           </w:p>
           <w:tbl>
@@ -13223,7 +16539,7 @@
               </w:tc>
             </w:tr>
           </w:tbl>
-          <w:bookmarkEnd w:id="70"/>
+          <w:bookmarkEnd w:id="122"/>
           <w:p/>
         </w:tc>
       </w:tr>
@@ -13240,7 +16556,7 @@
           <w:rPr>
             <w:rStyle w:val="Hyperlink"/>
           </w:rPr>
-          <w:t xml:space="preserve">Table 14</w:t>
+          <w:t xml:space="preserve">Table 15</w:t>
         </w:r>
       </w:hyperlink>
       <w:r>
@@ -13371,14 +16687,14 @@
         <w:t xml:space="preserve">manufacturing-scale capability.</w:t>
       </w:r>
     </w:p>
-    <w:bookmarkEnd w:id="71"/>
-    <w:bookmarkStart w:id="72" w:name="parameter-classification"/>
+    <w:bookmarkEnd w:id="123"/>
+    <w:bookmarkStart w:id="124" w:name="parameter-classification"/>
     <w:p>
       <w:pPr>
         <w:pStyle w:val="Heading1"/>
       </w:pPr>
       <w:r>
-        <w:t xml:space="preserve">8. Parameter classification</w:t>
+        <w:t xml:space="preserve">9. Parameter classification</w:t>
       </w:r>
     </w:p>
     <w:p>
@@ -13834,14 +17150,14 @@
         <w:t xml:space="preserve">constitute the step’s parameter control strategy.</w:t>
       </w:r>
     </w:p>
-    <w:bookmarkEnd w:id="72"/>
-    <w:bookmarkStart w:id="73" w:name="contribution-to-the-control-strategy"/>
+    <w:bookmarkEnd w:id="124"/>
+    <w:bookmarkStart w:id="125" w:name="contribution-to-the-control-strategy"/>
     <w:p>
       <w:pPr>
         <w:pStyle w:val="Heading1"/>
       </w:pPr>
       <w:r>
-        <w:t xml:space="preserve">9. Contribution to the control strategy</w:t>
+        <w:t xml:space="preserve">10. Contribution to the control strategy</w:t>
       </w:r>
     </w:p>
     <w:p>
@@ -14008,14 +17324,14 @@
         <w:t xml:space="preserve">1) of the whole drug-substance process.</w:t>
       </w:r>
     </w:p>
-    <w:bookmarkEnd w:id="73"/>
-    <w:bookmarkStart w:id="74" w:name="discussion"/>
+    <w:bookmarkEnd w:id="125"/>
+    <w:bookmarkStart w:id="126" w:name="discussion"/>
     <w:p>
       <w:pPr>
         <w:pStyle w:val="Heading1"/>
       </w:pPr>
       <w:r>
-        <w:t xml:space="preserve">10. Discussion</w:t>
+        <w:t xml:space="preserve">11. Discussion</w:t>
       </w:r>
     </w:p>
     <w:p>
@@ -14177,7 +17493,7 @@
         <w:t xml:space="preserve"> </w:t>
       </w:r>
       <w:r>
-        <w:t xml:space="preserve">within the proven acceptable ranges; operation beyond them would require assessment under the</w:t>
+        <w:t xml:space="preserve">within the characterization ranges; operation beyond them would require assessment under the</w:t>
       </w:r>
       <w:r>
         <w:t xml:space="preserve"> </w:t>
@@ -14198,14 +17514,14 @@
         <w:t xml:space="preserve">and the most stringent classification was therefore not needed at this step.</w:t>
       </w:r>
     </w:p>
-    <w:bookmarkEnd w:id="74"/>
-    <w:bookmarkStart w:id="75" w:name="conclusions"/>
+    <w:bookmarkEnd w:id="126"/>
+    <w:bookmarkStart w:id="127" w:name="conclusions"/>
     <w:p>
       <w:pPr>
         <w:pStyle w:val="Heading1"/>
       </w:pPr>
       <w:r>
-        <w:t xml:space="preserve">11. Conclusions</w:t>
+        <w:t xml:space="preserve">12. Conclusions</w:t>
       </w:r>
     </w:p>
     <w:p>
@@ -14288,14 +17604,14 @@
         <w:t xml:space="preserve">with this report in PCMR-001.</w:t>
       </w:r>
     </w:p>
-    <w:bookmarkEnd w:id="75"/>
-    <w:bookmarkStart w:id="79" w:name="deviations-from-the-plan"/>
+    <w:bookmarkEnd w:id="127"/>
+    <w:bookmarkStart w:id="131" w:name="deviations-from-the-plan"/>
     <w:p>
       <w:pPr>
         <w:pStyle w:val="Heading1"/>
       </w:pPr>
       <w:r>
-        <w:t xml:space="preserve">12. Deviations from the plan</w:t>
+        <w:t xml:space="preserve">13. Deviations from the plan</w:t>
       </w:r>
     </w:p>
     <w:p>
@@ -14322,7 +17638,7 @@
           <w:rPr>
             <w:rStyle w:val="Hyperlink"/>
           </w:rPr>
-          <w:t xml:space="preserve">Table 15</w:t>
+          <w:t xml:space="preserve">Table 16</w:t>
         </w:r>
       </w:hyperlink>
       <w:r>
@@ -14348,7 +17664,7 @@
       <w:tr>
         <w:tc>
           <w:tcPr/>
-          <w:bookmarkStart w:id="76" w:name="tbl-dev"/>
+          <w:bookmarkStart w:id="128" w:name="tbl-dev"/>
           <w:p>
             <w:pPr>
               <w:jc w:val="center"/>
@@ -14359,7 +17675,7 @@
               <w:pStyle w:val="ImageCaption"/>
             </w:pPr>
             <w:r>
-              <w:t xml:space="preserve">Table 15: Deviation register for PCR-003 — the deviations recorded during execution, with their disposition.</w:t>
+              <w:t xml:space="preserve">Table 16: Deviation register for PCR-003 — the deviations recorded during execution, with their disposition.</w:t>
             </w:r>
           </w:p>
           <w:tbl>
@@ -14541,18 +17857,18 @@
               </w:tc>
             </w:tr>
           </w:tbl>
-          <w:bookmarkEnd w:id="76"/>
+          <w:bookmarkEnd w:id="128"/>
           <w:p/>
         </w:tc>
       </w:tr>
     </w:tbl>
-    <w:bookmarkStart w:id="77" w:name="dev-003-01-dissolved-co₂-probe-drift"/>
+    <w:bookmarkStart w:id="129" w:name="dev-003-01-dissolved-co₂-probe-drift"/>
     <w:p>
       <w:pPr>
         <w:pStyle w:val="Heading2"/>
       </w:pPr>
       <w:r>
-        <w:t xml:space="preserve">12.1 DEV-003-01 — Dissolved-CO₂ probe drift</w:t>
+        <w:t xml:space="preserve">13.1 DEV-003-01 — Dissolved-CO₂ probe drift</w:t>
       </w:r>
     </w:p>
     <w:p>
@@ -14617,14 +17933,14 @@
         <w:t xml:space="preserve">parameter classifications were unchanged, so the deviation was retained.</w:t>
       </w:r>
     </w:p>
-    <w:bookmarkEnd w:id="77"/>
-    <w:bookmarkStart w:id="78" w:name="X8329f0e14a364443d536ee8baedd522fa6982ab"/>
+    <w:bookmarkEnd w:id="129"/>
+    <w:bookmarkStart w:id="130" w:name="X8329f0e14a364443d536ee8baedd522fa6982ab"/>
     <w:p>
       <w:pPr>
         <w:pStyle w:val="Heading2"/>
       </w:pPr>
       <w:r>
-        <w:t xml:space="preserve">12.2 DEV-003-02 — Nutrient feed-1 under-delivery</w:t>
+        <w:t xml:space="preserve">13.2 DEV-003-02 — Nutrient feed-1 under-delivery</w:t>
       </w:r>
     </w:p>
     <w:p>
@@ -14707,24 +18023,24 @@
         <w:t xml:space="preserve">control was reinforced for the commercial step (§Contribution to the control strategy).</w:t>
       </w:r>
     </w:p>
-    <w:bookmarkEnd w:id="78"/>
-    <w:bookmarkEnd w:id="79"/>
-    <w:bookmarkStart w:id="98" w:name="appendices"/>
+    <w:bookmarkEnd w:id="130"/>
+    <w:bookmarkEnd w:id="131"/>
+    <w:bookmarkStart w:id="150" w:name="appendices"/>
     <w:p>
       <w:pPr>
         <w:pStyle w:val="Heading1"/>
       </w:pPr>
       <w:r>
-        <w:t xml:space="preserve">13. Appendices</w:t>
+        <w:t xml:space="preserve">14. Appendices</w:t>
       </w:r>
     </w:p>
-    <w:bookmarkStart w:id="82" w:name="X77c0ef24ce4de9c1b8c35876c233736670b0bf3"/>
+    <w:bookmarkStart w:id="134" w:name="X77c0ef24ce4de9c1b8c35876c233736670b0bf3"/>
     <w:p>
       <w:pPr>
         <w:pStyle w:val="Heading2"/>
       </w:pPr>
       <w:r>
-        <w:t xml:space="preserve">13.1 Appendix A — Screening design matrix and responses</w:t>
+        <w:t xml:space="preserve">14.1 Appendix A — Screening design matrix and responses</w:t>
       </w:r>
     </w:p>
     <w:p>
@@ -14741,17 +18057,6 @@
         <w:t xml:space="preserve">factor settings (</w:t>
       </w:r>
       <w:hyperlink w:anchor="tbl-appA1">
-        <w:r>
-          <w:rPr>
-            <w:rStyle w:val="Hyperlink"/>
-          </w:rPr>
-          <w:t xml:space="preserve">Table 16</w:t>
-        </w:r>
-      </w:hyperlink>
-      <w:r>
-        <w:t xml:space="preserve">) and the responses (</w:t>
-      </w:r>
-      <w:hyperlink w:anchor="tbl-appA2">
         <w:r>
           <w:rPr>
             <w:rStyle w:val="Hyperlink"/>
@@ -14760,13 +18065,24 @@
         </w:r>
       </w:hyperlink>
       <w:r>
+        <w:t xml:space="preserve">) and the responses (</w:t>
+      </w:r>
+      <w:hyperlink w:anchor="tbl-appA2">
+        <w:r>
+          <w:rPr>
+            <w:rStyle w:val="Hyperlink"/>
+          </w:rPr>
+          <w:t xml:space="preserve">Table 18</w:t>
+        </w:r>
+      </w:hyperlink>
+      <w:r>
         <w:t xml:space="preserve">); the coded levels are −1 and +1 at</w:t>
       </w:r>
       <w:r>
         <w:t xml:space="preserve"> </w:t>
       </w:r>
       <w:r>
-        <w:t xml:space="preserve">the PAR edges and 0 at the centre.</w:t>
+        <w:t xml:space="preserve">the characterization-range edges and 0 at the centre.</w:t>
       </w:r>
     </w:p>
     <w:tbl>
@@ -14782,7 +18098,7 @@
       <w:tr>
         <w:tc>
           <w:tcPr/>
-          <w:bookmarkStart w:id="80" w:name="tbl-appA1"/>
+          <w:bookmarkStart w:id="132" w:name="tbl-appA1"/>
           <w:p>
             <w:pPr>
               <w:jc w:val="center"/>
@@ -14793,7 +18109,7 @@
               <w:pStyle w:val="ImageCaption"/>
             </w:pPr>
             <w:r>
-              <w:t xml:space="preserve">Table 16: Screening design — coded factor settings.</w:t>
+              <w:t xml:space="preserve">Table 17: Screening design — coded factor settings.</w:t>
             </w:r>
           </w:p>
           <w:tbl>
@@ -16675,7 +19991,7 @@
               </w:tc>
             </w:tr>
           </w:tbl>
-          <w:bookmarkEnd w:id="80"/>
+          <w:bookmarkEnd w:id="132"/>
           <w:p/>
         </w:tc>
       </w:tr>
@@ -16701,7 +20017,7 @@
       <w:tr>
         <w:tc>
           <w:tcPr/>
-          <w:bookmarkStart w:id="81" w:name="tbl-appA2"/>
+          <w:bookmarkStart w:id="133" w:name="tbl-appA2"/>
           <w:p>
             <w:pPr>
               <w:jc w:val="center"/>
@@ -16712,7 +20028,7 @@
               <w:pStyle w:val="ImageCaption"/>
             </w:pPr>
             <w:r>
-              <w:t xml:space="preserve">Table 17: Screening design — measured responses.</w:t>
+              <w:t xml:space="preserve">Table 18: Screening design — measured responses.</w:t>
             </w:r>
           </w:p>
           <w:tbl>
@@ -18595,19 +21911,19 @@
               </w:tc>
             </w:tr>
           </w:tbl>
-          <w:bookmarkEnd w:id="81"/>
+          <w:bookmarkEnd w:id="133"/>
           <w:p/>
         </w:tc>
       </w:tr>
     </w:tbl>
-    <w:bookmarkEnd w:id="82"/>
-    <w:bookmarkStart w:id="85" w:name="Xc987739a58e5854fe31352d470a2bebef9123c1"/>
+    <w:bookmarkEnd w:id="134"/>
+    <w:bookmarkStart w:id="137" w:name="Xc987739a58e5854fe31352d470a2bebef9123c1"/>
     <w:p>
       <w:pPr>
         <w:pStyle w:val="Heading2"/>
       </w:pPr>
       <w:r>
-        <w:t xml:space="preserve">13.2 Appendix B — Response-surface design matrix and responses</w:t>
+        <w:t xml:space="preserve">14.2 Appendix B — Response-surface design matrix and responses</w:t>
       </w:r>
     </w:p>
     <w:p>
@@ -18628,7 +21944,7 @@
           <w:rPr>
             <w:rStyle w:val="Hyperlink"/>
           </w:rPr>
-          <w:t xml:space="preserve">Table 18</w:t>
+          <w:t xml:space="preserve">Table 19</w:t>
         </w:r>
       </w:hyperlink>
       <w:r>
@@ -18639,7 +21955,7 @@
           <w:rPr>
             <w:rStyle w:val="Hyperlink"/>
           </w:rPr>
-          <w:t xml:space="preserve">Table 19</w:t>
+          <w:t xml:space="preserve">Table 20</w:t>
         </w:r>
       </w:hyperlink>
       <w:r>
@@ -18659,7 +21975,7 @@
       <w:tr>
         <w:tc>
           <w:tcPr/>
-          <w:bookmarkStart w:id="83" w:name="tbl-appB1"/>
+          <w:bookmarkStart w:id="135" w:name="tbl-appB1"/>
           <w:p>
             <w:pPr>
               <w:jc w:val="center"/>
@@ -18670,7 +21986,7 @@
               <w:pStyle w:val="ImageCaption"/>
             </w:pPr>
             <w:r>
-              <w:t xml:space="preserve">Table 18: Response-surface design — coded factor settings.</w:t>
+              <w:t xml:space="preserve">Table 19: Response-surface design — coded factor settings.</w:t>
             </w:r>
           </w:p>
           <w:tbl>
@@ -21011,7 +24327,7 @@
               </w:tc>
             </w:tr>
           </w:tbl>
-          <w:bookmarkEnd w:id="83"/>
+          <w:bookmarkEnd w:id="135"/>
           <w:p/>
         </w:tc>
       </w:tr>
@@ -21037,7 +24353,7 @@
       <w:tr>
         <w:tc>
           <w:tcPr/>
-          <w:bookmarkStart w:id="84" w:name="tbl-appB2"/>
+          <w:bookmarkStart w:id="136" w:name="tbl-appB2"/>
           <w:p>
             <w:pPr>
               <w:jc w:val="center"/>
@@ -21048,7 +24364,7 @@
               <w:pStyle w:val="ImageCaption"/>
             </w:pPr>
             <w:r>
-              <w:t xml:space="preserve">Table 19: Response-surface design — measured responses.</w:t>
+              <w:t xml:space="preserve">Table 20: Response-surface design — measured responses.</w:t>
             </w:r>
           </w:p>
           <w:tbl>
@@ -23768,19 +27084,19 @@
               </w:tc>
             </w:tr>
           </w:tbl>
-          <w:bookmarkEnd w:id="84"/>
+          <w:bookmarkEnd w:id="136"/>
           <w:p/>
         </w:tc>
       </w:tr>
     </w:tbl>
-    <w:bookmarkEnd w:id="85"/>
-    <w:bookmarkStart w:id="95" w:name="Xa2fac5041b4173f7385fa99ae36b1e5b6f06fdd"/>
+    <w:bookmarkEnd w:id="137"/>
+    <w:bookmarkStart w:id="147" w:name="Xa2fac5041b4173f7385fa99ae36b1e5b6f06fdd"/>
     <w:p>
       <w:pPr>
         <w:pStyle w:val="Heading2"/>
       </w:pPr>
       <w:r>
-        <w:t xml:space="preserve">13.3 Appendix C — Full effect and coefficient tables</w:t>
+        <w:t xml:space="preserve">14.3 Appendix C — Full effect and coefficient tables</w:t>
       </w:r>
     </w:p>
     <w:p>
@@ -23816,7 +27132,7 @@
       <w:tr>
         <w:tc>
           <w:tcPr/>
-          <w:bookmarkStart w:id="86" w:name="tbl-scr-afucosylation"/>
+          <w:bookmarkStart w:id="138" w:name="tbl-scr-afucosylation"/>
           <w:p>
             <w:pPr>
               <w:jc w:val="center"/>
@@ -23827,7 +27143,7 @@
               <w:pStyle w:val="ImageCaption"/>
             </w:pPr>
             <w:r>
-              <w:t xml:space="preserve">Table 20: Screening effect estimates — Afucosylation (coded factors).</w:t>
+              <w:t xml:space="preserve">Table 21: Screening effect estimates — Afucosylation (coded factors).</w:t>
             </w:r>
           </w:p>
           <w:tbl>
@@ -25278,7 +28594,7 @@
               </w:tc>
             </w:tr>
           </w:tbl>
-          <w:bookmarkEnd w:id="86"/>
+          <w:bookmarkEnd w:id="138"/>
           <w:p/>
         </w:tc>
       </w:tr>
@@ -25304,7 +28620,7 @@
       <w:tr>
         <w:tc>
           <w:tcPr/>
-          <w:bookmarkStart w:id="87" w:name="tbl-scr-galactosylation"/>
+          <w:bookmarkStart w:id="139" w:name="tbl-scr-galactosylation"/>
           <w:p>
             <w:pPr>
               <w:jc w:val="center"/>
@@ -25315,7 +28631,7 @@
               <w:pStyle w:val="ImageCaption"/>
             </w:pPr>
             <w:r>
-              <w:t xml:space="preserve">Table 21: Screening effect estimates — Galactosylation (coded factors).</w:t>
+              <w:t xml:space="preserve">Table 22: Screening effect estimates — Galactosylation (coded factors).</w:t>
             </w:r>
           </w:p>
           <w:tbl>
@@ -26811,7 +30127,7 @@
               </w:tc>
             </w:tr>
           </w:tbl>
-          <w:bookmarkEnd w:id="87"/>
+          <w:bookmarkEnd w:id="139"/>
           <w:p/>
         </w:tc>
       </w:tr>
@@ -26837,7 +30153,7 @@
       <w:tr>
         <w:tc>
           <w:tcPr/>
-          <w:bookmarkStart w:id="88" w:name="tbl-scr-high-mannose"/>
+          <w:bookmarkStart w:id="140" w:name="tbl-scr-high-mannose"/>
           <w:p>
             <w:pPr>
               <w:jc w:val="center"/>
@@ -26848,7 +30164,7 @@
               <w:pStyle w:val="ImageCaption"/>
             </w:pPr>
             <w:r>
-              <w:t xml:space="preserve">Table 22: Screening effect estimates — High mannose (coded factors).</w:t>
+              <w:t xml:space="preserve">Table 23: Screening effect estimates — High mannose (coded factors).</w:t>
             </w:r>
           </w:p>
           <w:tbl>
@@ -28294,7 +31610,7 @@
               </w:tc>
             </w:tr>
           </w:tbl>
-          <w:bookmarkEnd w:id="88"/>
+          <w:bookmarkEnd w:id="140"/>
           <w:p/>
         </w:tc>
       </w:tr>
@@ -28320,7 +31636,7 @@
       <w:tr>
         <w:tc>
           <w:tcPr/>
-          <w:bookmarkStart w:id="89" w:name="tbl-scr-acidic-variants"/>
+          <w:bookmarkStart w:id="141" w:name="tbl-scr-acidic-variants"/>
           <w:p>
             <w:pPr>
               <w:jc w:val="center"/>
@@ -28331,7 +31647,7 @@
               <w:pStyle w:val="ImageCaption"/>
             </w:pPr>
             <w:r>
-              <w:t xml:space="preserve">Table 23: Screening effect estimates — Acidic variants (coded factors).</w:t>
+              <w:t xml:space="preserve">Table 24: Screening effect estimates — Acidic variants (coded factors).</w:t>
             </w:r>
           </w:p>
           <w:tbl>
@@ -29802,7 +33118,7 @@
               </w:tc>
             </w:tr>
           </w:tbl>
-          <w:bookmarkEnd w:id="89"/>
+          <w:bookmarkEnd w:id="141"/>
           <w:p/>
         </w:tc>
       </w:tr>
@@ -29828,7 +33144,7 @@
       <w:tr>
         <w:tc>
           <w:tcPr/>
-          <w:bookmarkStart w:id="90" w:name="tbl-scr-aggregates-hmw"/>
+          <w:bookmarkStart w:id="142" w:name="tbl-scr-aggregates-hmw"/>
           <w:p>
             <w:pPr>
               <w:jc w:val="center"/>
@@ -29839,7 +33155,7 @@
               <w:pStyle w:val="ImageCaption"/>
             </w:pPr>
             <w:r>
-              <w:t xml:space="preserve">Table 24: Screening effect estimates — Aggregates (HMW) (coded factors).</w:t>
+              <w:t xml:space="preserve">Table 25: Screening effect estimates — Aggregates (HMW) (coded factors).</w:t>
             </w:r>
           </w:p>
           <w:tbl>
@@ -31290,7 +34606,7 @@
               </w:tc>
             </w:tr>
           </w:tbl>
-          <w:bookmarkEnd w:id="90"/>
+          <w:bookmarkEnd w:id="142"/>
           <w:p/>
         </w:tc>
       </w:tr>
@@ -31316,7 +34632,7 @@
       <w:tr>
         <w:tc>
           <w:tcPr/>
-          <w:bookmarkStart w:id="91" w:name="tbl-rsmc-galactosylation"/>
+          <w:bookmarkStart w:id="143" w:name="tbl-rsmc-galactosylation"/>
           <w:p>
             <w:pPr>
               <w:jc w:val="center"/>
@@ -31327,7 +34643,7 @@
               <w:pStyle w:val="ImageCaption"/>
             </w:pPr>
             <w:r>
-              <w:t xml:space="preserve">Table 25: Response-surface coefficients — Galactosylation (coded factors).</w:t>
+              <w:t xml:space="preserve">Table 26: Response-surface coefficients — Galactosylation (coded factors).</w:t>
             </w:r>
           </w:p>
           <w:tbl>
@@ -32593,7 +35909,7 @@
               </w:tc>
             </w:tr>
           </w:tbl>
-          <w:bookmarkEnd w:id="91"/>
+          <w:bookmarkEnd w:id="143"/>
           <w:p/>
         </w:tc>
       </w:tr>
@@ -32619,7 +35935,7 @@
       <w:tr>
         <w:tc>
           <w:tcPr/>
-          <w:bookmarkStart w:id="92" w:name="tbl-rsmc-high-mannose"/>
+          <w:bookmarkStart w:id="144" w:name="tbl-rsmc-high-mannose"/>
           <w:p>
             <w:pPr>
               <w:jc w:val="center"/>
@@ -32630,7 +35946,7 @@
               <w:pStyle w:val="ImageCaption"/>
             </w:pPr>
             <w:r>
-              <w:t xml:space="preserve">Table 26: Response-surface coefficients — High mannose (coded factors).</w:t>
+              <w:t xml:space="preserve">Table 27: Response-surface coefficients — High mannose (coded factors).</w:t>
             </w:r>
           </w:p>
           <w:tbl>
@@ -33881,7 +37197,7 @@
               </w:tc>
             </w:tr>
           </w:tbl>
-          <w:bookmarkEnd w:id="92"/>
+          <w:bookmarkEnd w:id="144"/>
           <w:p/>
         </w:tc>
       </w:tr>
@@ -33907,7 +37223,7 @@
       <w:tr>
         <w:tc>
           <w:tcPr/>
-          <w:bookmarkStart w:id="93" w:name="tbl-rsmc-acidic-variants"/>
+          <w:bookmarkStart w:id="145" w:name="tbl-rsmc-acidic-variants"/>
           <w:p>
             <w:pPr>
               <w:jc w:val="center"/>
@@ -33918,7 +37234,7 @@
               <w:pStyle w:val="ImageCaption"/>
             </w:pPr>
             <w:r>
-              <w:t xml:space="preserve">Table 27: Response-surface coefficients — Acidic variants (coded factors).</w:t>
+              <w:t xml:space="preserve">Table 28: Response-surface coefficients — Acidic variants (coded factors).</w:t>
             </w:r>
           </w:p>
           <w:tbl>
@@ -35169,7 +38485,7 @@
               </w:tc>
             </w:tr>
           </w:tbl>
-          <w:bookmarkEnd w:id="93"/>
+          <w:bookmarkEnd w:id="145"/>
           <w:p/>
         </w:tc>
       </w:tr>
@@ -35195,7 +38511,7 @@
       <w:tr>
         <w:tc>
           <w:tcPr/>
-          <w:bookmarkStart w:id="94" w:name="tbl-rsmc-aggregates-hmw"/>
+          <w:bookmarkStart w:id="146" w:name="tbl-rsmc-aggregates-hmw"/>
           <w:p>
             <w:pPr>
               <w:jc w:val="center"/>
@@ -35206,7 +38522,7 @@
               <w:pStyle w:val="ImageCaption"/>
             </w:pPr>
             <w:r>
-              <w:t xml:space="preserve">Table 28: Response-surface coefficients — Aggregates (HMW) (coded factors).</w:t>
+              <w:t xml:space="preserve">Table 29: Response-surface coefficients — Aggregates (HMW) (coded factors).</w:t>
             </w:r>
           </w:p>
           <w:tbl>
@@ -36452,19 +39768,19 @@
               </w:tc>
             </w:tr>
           </w:tbl>
-          <w:bookmarkEnd w:id="94"/>
+          <w:bookmarkEnd w:id="146"/>
           <w:p/>
         </w:tc>
       </w:tr>
     </w:tbl>
-    <w:bookmarkEnd w:id="95"/>
-    <w:bookmarkStart w:id="97" w:name="appendix-d-analytical-methods-summary"/>
+    <w:bookmarkEnd w:id="147"/>
+    <w:bookmarkStart w:id="149" w:name="appendix-d-analytical-methods-summary"/>
     <w:p>
       <w:pPr>
         <w:pStyle w:val="Heading2"/>
       </w:pPr>
       <w:r>
-        <w:t xml:space="preserve">13.4 Appendix D — Analytical methods summary</w:t>
+        <w:t xml:space="preserve">14.4 Appendix D — Analytical methods summary</w:t>
       </w:r>
     </w:p>
     <w:p>
@@ -36488,7 +39804,7 @@
           <w:rPr>
             <w:rStyle w:val="Hyperlink"/>
           </w:rPr>
-          <w:t xml:space="preserve">Table 29</w:t>
+          <w:t xml:space="preserve">Table 30</w:t>
         </w:r>
       </w:hyperlink>
       <w:r>
@@ -36508,7 +39824,7 @@
       <w:tr>
         <w:tc>
           <w:tcPr/>
-          <w:bookmarkStart w:id="96" w:name="tbl-appD"/>
+          <w:bookmarkStart w:id="148" w:name="tbl-appD"/>
           <w:p>
             <w:pPr>
               <w:jc w:val="center"/>
@@ -36519,7 +39835,7 @@
               <w:pStyle w:val="ImageCaption"/>
             </w:pPr>
             <w:r>
-              <w:t xml:space="preserve">Table 29: Analytical methods summary — technique, analyte and reportable unit for each validated method.</w:t>
+              <w:t xml:space="preserve">Table 30: Analytical methods summary — technique, analyte and reportable unit for each validated method.</w:t>
             </w:r>
           </w:p>
           <w:tbl>
@@ -36863,7 +40179,7 @@
               </w:tc>
             </w:tr>
           </w:tbl>
-          <w:bookmarkEnd w:id="96"/>
+          <w:bookmarkEnd w:id="148"/>
           <w:p/>
         </w:tc>
       </w:tr>
@@ -36873,9 +40189,9 @@
         <w:br w:type="page"/>
       </w:r>
     </w:p>
-    <w:bookmarkEnd w:id="97"/>
-    <w:bookmarkEnd w:id="98"/>
-    <w:bookmarkStart w:id="107" w:name="references"/>
+    <w:bookmarkEnd w:id="149"/>
+    <w:bookmarkEnd w:id="150"/>
+    <w:bookmarkStart w:id="159" w:name="references"/>
     <w:p>
       <w:pPr>
         <w:pStyle w:val="Heading1"/>
@@ -36884,8 +40200,8 @@
         <w:t xml:space="preserve">References</w:t>
       </w:r>
     </w:p>
-    <w:bookmarkStart w:id="106" w:name="refs"/>
-    <w:bookmarkStart w:id="99" w:name="ref-amab2009"/>
+    <w:bookmarkStart w:id="158" w:name="refs"/>
+    <w:bookmarkStart w:id="151" w:name="ref-amab2009"/>
     <w:p>
       <w:pPr>
         <w:pStyle w:val="Bibliography"/>
@@ -36907,8 +40223,8 @@
         <w:t xml:space="preserve">. CASSS.</w:t>
       </w:r>
     </w:p>
-    <w:bookmarkEnd w:id="99"/>
-    <w:bookmarkStart w:id="100" w:name="ref-ichq8"/>
+    <w:bookmarkEnd w:id="151"/>
+    <w:bookmarkStart w:id="152" w:name="ref-ichq8"/>
     <w:p>
       <w:pPr>
         <w:pStyle w:val="Bibliography"/>
@@ -36930,8 +40246,8 @@
         <w:t xml:space="preserve">. ICH.</w:t>
       </w:r>
     </w:p>
-    <w:bookmarkEnd w:id="100"/>
-    <w:bookmarkStart w:id="101" w:name="ref-ichq11"/>
+    <w:bookmarkEnd w:id="152"/>
+    <w:bookmarkStart w:id="153" w:name="ref-ichq11"/>
     <w:p>
       <w:pPr>
         <w:pStyle w:val="Bibliography"/>
@@ -36953,8 +40269,8 @@
         <w:t xml:space="preserve">. ICH.</w:t>
       </w:r>
     </w:p>
-    <w:bookmarkEnd w:id="101"/>
-    <w:bookmarkStart w:id="102" w:name="ref-ichq9"/>
+    <w:bookmarkEnd w:id="153"/>
+    <w:bookmarkStart w:id="154" w:name="ref-ichq9"/>
     <w:p>
       <w:pPr>
         <w:pStyle w:val="Bibliography"/>
@@ -36976,8 +40292,8 @@
         <w:t xml:space="preserve">. ICH.</w:t>
       </w:r>
     </w:p>
-    <w:bookmarkEnd w:id="102"/>
-    <w:bookmarkStart w:id="103" w:name="ref-ispegpg2023"/>
+    <w:bookmarkEnd w:id="154"/>
+    <w:bookmarkStart w:id="155" w:name="ref-ispegpg2023"/>
     <w:p>
       <w:pPr>
         <w:pStyle w:val="Bibliography"/>
@@ -36999,8 +40315,8 @@
         <w:t xml:space="preserve">. ISPE.</w:t>
       </w:r>
     </w:p>
-    <w:bookmarkEnd w:id="103"/>
-    <w:bookmarkStart w:id="104" w:name="ref-pdatr60"/>
+    <w:bookmarkEnd w:id="155"/>
+    <w:bookmarkStart w:id="156" w:name="ref-pdatr60"/>
     <w:p>
       <w:pPr>
         <w:pStyle w:val="Bibliography"/>
@@ -37022,8 +40338,8 @@
         <w:t xml:space="preserve">. PDA.</w:t>
       </w:r>
     </w:p>
-    <w:bookmarkEnd w:id="104"/>
-    <w:bookmarkStart w:id="105" w:name="ref-fda2011"/>
+    <w:bookmarkEnd w:id="156"/>
+    <w:bookmarkStart w:id="157" w:name="ref-fda2011"/>
     <w:p>
       <w:pPr>
         <w:pStyle w:val="Bibliography"/>
@@ -37045,9 +40361,9 @@
         <w:t xml:space="preserve">. FDA.</w:t>
       </w:r>
     </w:p>
-    <w:bookmarkEnd w:id="105"/>
-    <w:bookmarkEnd w:id="106"/>
-    <w:bookmarkEnd w:id="107"/>
+    <w:bookmarkEnd w:id="157"/>
+    <w:bookmarkEnd w:id="158"/>
+    <w:bookmarkEnd w:id="159"/>
     <w:sectPr>
       <w:footnotePr>
         <w:numRestart w:val="eachSect"/>

</xml_diff>